<commit_message>
Update terbaru setelah konsul ke 2
</commit_message>
<xml_diff>
--- a/CV_Tajuk_BRD_Nicholas_Yuwito.docx
+++ b/CV_Tajuk_BRD_Nicholas_Yuwito.docx
@@ -49,9 +49,9 @@
     <w:tbl>
       <w:tblPr>
         <w:tblW w:type="dxa" w:w="9360"/>
-        <w:jc w:val="left"/>
         <w:tblLayout w:type="fixed"/>
         <w:tblLook w:firstColumn="1" w:firstRow="1" w:lastColumn="0" w:lastRow="0" w:noHBand="0" w:noVBand="1" w:val="04A0"/>
+        <w:jc w:val="center"/>
         <w:tblInd w:type="dxa" w:w="120"/>
         <w:tblBorders>
           <w:top w:val="single" w:sz="4" w:space="0" w:color="CBD5E1"/>
@@ -271,17 +271,12 @@
             </w:tcMar>
           </w:tcPr>
           <w:p>
-            <w:pPr>
-              <w:spacing w:before="0" w:after="60" w:line="264" w:lineRule="auto"/>
-            </w:pPr>
-            <w:r>
-              <w:rPr>
-                <w:rFonts w:ascii="Calibri" w:hAnsi="Calibri"/>
-                <w:b w:val="0"/>
-                <w:color w:val="1F2937"/>
-                <w:sz w:val="20"/>
-              </w:rPr>
-              <w:t>June 23, 2026</w:t>
+            <w:r>
+              <w:rPr>
+                <w:b w:val="0"/>
+                <w:sz w:val="18"/>
+              </w:rPr>
+              <w:t>July 7, 2026</w:t>
             </w:r>
           </w:p>
         </w:tc>
@@ -326,17 +321,12 @@
             </w:tcMar>
           </w:tcPr>
           <w:p>
-            <w:pPr>
-              <w:spacing w:before="0" w:after="60" w:line="264" w:lineRule="auto"/>
-            </w:pPr>
-            <w:r>
-              <w:rPr>
-                <w:rFonts w:ascii="Calibri" w:hAnsi="Calibri"/>
-                <w:b w:val="0"/>
-                <w:color w:val="1F2937"/>
-                <w:sz w:val="20"/>
-              </w:rPr>
-              <w:t>Draft for thesis appendix / supervisor review</w:t>
+            <w:r>
+              <w:rPr>
+                <w:b w:val="0"/>
+                <w:sz w:val="18"/>
+              </w:rPr>
+              <w:t>Updated draft for thesis appendix / supervisor review</w:t>
             </w:r>
           </w:p>
         </w:tc>
@@ -345,9 +335,9 @@
     <w:tbl>
       <w:tblPr>
         <w:tblW w:type="dxa" w:w="9360"/>
-        <w:jc w:val="left"/>
         <w:tblLayout w:type="fixed"/>
         <w:tblLook w:firstColumn="1" w:firstRow="1" w:lastColumn="0" w:lastRow="0" w:noHBand="0" w:noVBand="1" w:val="04A0"/>
+        <w:jc w:val="center"/>
         <w:tblInd w:type="dxa" w:w="120"/>
         <w:tblBorders>
           <w:top w:val="single" w:sz="4" w:space="0" w:color="CBD5E1"/>
@@ -375,25 +365,12 @@
             <w:shd w:fill="F8FAFC"/>
           </w:tcPr>
           <w:p>
-            <w:pPr>
-              <w:spacing w:before="0" w:after="40" w:line="264" w:lineRule="auto"/>
-            </w:pPr>
-            <w:r>
-              <w:rPr>
-                <w:rFonts w:ascii="Calibri" w:hAnsi="Calibri"/>
-                <w:b/>
-                <w:color w:val="1F4D78"/>
-                <w:sz w:val="20"/>
-              </w:rPr>
-              <w:t xml:space="preserve">Source basis: </w:t>
-            </w:r>
-            <w:r>
-              <w:rPr>
-                <w:rFonts w:ascii="Calibri" w:hAnsi="Calibri"/>
-                <w:color w:val="1F2937"/>
-                <w:sz w:val="20"/>
-              </w:rPr>
-              <w:t>This BRD is based on the thesis PDF reference and the current local MVP project documentation, code structure, Prisma schema, and documented user flows. It does not claim production readiness or full company-wide implementation.</w:t>
+            <w:r>
+              <w:rPr>
+                <w:b w:val="0"/>
+                <w:sz w:val="18"/>
+              </w:rPr>
+              <w:t>Source basis: This BRD is based on the thesis PDF reference, current local MVP project documentation, code structure, Prisma schema, documented user flows, and the updated requested scope covering Product master data, Pre Order/PO Sales Order flow, pricing adjustment, notifications, printed outputs, and table interaction improvements. It does not claim production readiness or full company-wide implementation.</w:t>
             </w:r>
           </w:p>
         </w:tc>
@@ -420,9 +397,9 @@
     <w:tbl>
       <w:tblPr>
         <w:tblW w:type="dxa" w:w="9360"/>
-        <w:jc w:val="left"/>
         <w:tblLayout w:type="fixed"/>
         <w:tblLook w:firstColumn="1" w:firstRow="1" w:lastColumn="0" w:lastRow="0" w:noHBand="0" w:noVBand="1" w:val="04A0"/>
+        <w:jc w:val="center"/>
         <w:tblInd w:type="dxa" w:w="120"/>
         <w:tblBorders>
           <w:top w:val="single" w:sz="4" w:space="0" w:color="CBD5E1"/>
@@ -654,6 +631,68 @@
                 <w:sz w:val="18"/>
               </w:rPr>
               <w:t>Initial BRD prepared for academic thesis documentation based on thesis source material and current MVP scope.</w:t>
+            </w:r>
+          </w:p>
+        </w:tc>
+      </w:tr>
+      <w:tr>
+        <w:tc>
+          <w:tcPr>
+            <w:tcW w:type="dxa" w:w="1200"/>
+            <w:vAlign w:val="center"/>
+          </w:tcPr>
+          <w:p>
+            <w:r>
+              <w:rPr>
+                <w:b w:val="0"/>
+                <w:sz w:val="18"/>
+              </w:rPr>
+              <w:t>1.1</w:t>
+            </w:r>
+          </w:p>
+        </w:tc>
+        <w:tc>
+          <w:tcPr>
+            <w:tcW w:type="dxa" w:w="1800"/>
+            <w:vAlign w:val="center"/>
+          </w:tcPr>
+          <w:p>
+            <w:r>
+              <w:rPr>
+                <w:b w:val="0"/>
+                <w:sz w:val="18"/>
+              </w:rPr>
+              <w:t>July 7, 2026</w:t>
+            </w:r>
+          </w:p>
+        </w:tc>
+        <w:tc>
+          <w:tcPr>
+            <w:tcW w:type="dxa" w:w="2100"/>
+            <w:vAlign w:val="center"/>
+          </w:tcPr>
+          <w:p>
+            <w:r>
+              <w:rPr>
+                <w:b w:val="0"/>
+                <w:sz w:val="18"/>
+              </w:rPr>
+              <w:t>Nicholas Yuwito</w:t>
+            </w:r>
+          </w:p>
+        </w:tc>
+        <w:tc>
+          <w:tcPr>
+            <w:tcW w:type="dxa" w:w="4260"/>
+            <w:vAlign w:val="center"/>
+          </w:tcPr>
+          <w:p>
+            <w:r>
+              <w:rPr>
+                <w:b w:val="0"/>
+                <w:sz w:val="18"/>
+              </w:rPr>
+              <w:t>Updated BRD scope and requirements to include Product master data, separated Pre Order/PO transaction handling, product-based pricing with optional markup/discount, PO reminders, printed document updates, table sort/filter behavior, and an activity diagram.</w:t>
             </w:r>
           </w:p>
         </w:tc>
@@ -703,12 +742,7 @@
         <w:spacing w:before="0" w:after="120" w:line="264" w:lineRule="auto"/>
       </w:pPr>
       <w:r>
-        <w:rPr>
-          <w:rFonts w:ascii="Calibri" w:hAnsi="Calibri"/>
-          <w:color w:val="1F2937"/>
-          <w:sz w:val="22"/>
-        </w:rPr>
-        <w:t>The proposed system supports a more centralized and structured revenue-cycle flow covering customer data, sales orders, invoices, payments, receivables, billing/follow-up activity, Surat Jalan delivery documentation, dashboard insight, and audit trail evidence. The requirements in this BRD are intentionally scoped to a local academic prototype and avoid enterprise-level assumptions.</w:t>
+        <w:t>The proposed system supports a more centralized and structured revenue-cycle flow covering customer data, product master data, normal sales orders, Pre Order/PO transactions, invoices, payments, receivables, billing/follow-up activity, Surat Jalan, dashboard visibility, notifications, and audit trail evidence.</w:t>
       </w:r>
     </w:p>
     <w:p>
@@ -748,9 +782,9 @@
     <w:tbl>
       <w:tblPr>
         <w:tblW w:type="dxa" w:w="9360"/>
-        <w:jc w:val="left"/>
         <w:tblLayout w:type="fixed"/>
         <w:tblLook w:firstColumn="1" w:firstRow="1" w:lastColumn="0" w:lastRow="0" w:noHBand="0" w:noVBand="1" w:val="04A0"/>
+        <w:jc w:val="center"/>
         <w:tblInd w:type="dxa" w:w="120"/>
         <w:tblBorders>
           <w:top w:val="single" w:sz="4" w:space="0" w:color="CBD5E1"/>
@@ -1301,12 +1335,7 @@
         <w:spacing w:before="0" w:after="120" w:line="264" w:lineRule="auto"/>
       </w:pPr>
       <w:r>
-        <w:rPr>
-          <w:rFonts w:ascii="Calibri" w:hAnsi="Calibri"/>
-          <w:color w:val="1F2937"/>
-          <w:sz w:val="22"/>
-        </w:rPr>
-        <w:t>The current MVP responds to this background by using Sales Order as the starting transaction record and reusing connected data through Invoice, Payment, Surat Jalan, Receivable, Billing, Follow Up, Dashboard, and Audit Trail modules. This reflects the thesis direction of reducing repeated manual input and improving visibility without assuming a full ERP implementation.</w:t>
+        <w:t>The current MVP responds to this background by using Sales Order and Pre Order/PO as starting transaction records, reusing connected data through Invoice, Payment, Surat Jalan, Receivable, Billing, Follow Up, Product, Dashboard, Notification, and Audit Trail modules.</w:t>
       </w:r>
     </w:p>
     <w:p>
@@ -1407,6 +1436,30 @@
     </w:p>
     <w:p>
       <w:pPr>
+        <w:pStyle w:val="ListBullet"/>
+      </w:pPr>
+      <w:r>
+        <w:t>Product names and base prices need to be standardized so Sales Order and Pre Order item entry does not rely on inconsistent free-text input.</w:t>
+      </w:r>
+    </w:p>
+    <w:p>
+      <w:pPr>
+        <w:pStyle w:val="ListBullet"/>
+      </w:pPr>
+      <w:r>
+        <w:t>Pre Order/PO transactions require clearer tracking of uploaded PO documents, manually entered PO/Sales Order IDs, required dates, and reminders before the product-needed date.</w:t>
+      </w:r>
+    </w:p>
+    <w:p>
+      <w:pPr>
+        <w:pStyle w:val="ListBullet"/>
+      </w:pPr>
+      <w:r>
+        <w:t>Operational tables require working sort and filter behavior so users can review customer, product, transaction, invoice, payment, and receivable information efficiently.</w:t>
+      </w:r>
+    </w:p>
+    <w:p>
+      <w:pPr>
         <w:pStyle w:val="Heading1"/>
       </w:pPr>
       <w:r>
@@ -1416,9 +1469,9 @@
     <w:tbl>
       <w:tblPr>
         <w:tblW w:type="dxa" w:w="9360"/>
-        <w:jc w:val="left"/>
         <w:tblLayout w:type="fixed"/>
         <w:tblLook w:firstColumn="1" w:firstRow="1" w:lastColumn="0" w:lastRow="0" w:noHBand="0" w:noVBand="1" w:val="04A0"/>
+        <w:jc w:val="center"/>
         <w:tblInd w:type="dxa" w:w="120"/>
         <w:tblBorders>
           <w:top w:val="single" w:sz="4" w:space="0" w:color="CBD5E1"/>
@@ -1812,6 +1865,102 @@
                 <w:sz w:val="18"/>
               </w:rPr>
               <w:t>Preserve audit evidence for important business actions performed in the system.</w:t>
+            </w:r>
+          </w:p>
+        </w:tc>
+      </w:tr>
+      <w:tr>
+        <w:tc>
+          <w:tcPr>
+            <w:tcW w:type="dxa" w:w="1500"/>
+            <w:vAlign w:val="center"/>
+          </w:tcPr>
+          <w:p>
+            <w:r>
+              <w:rPr>
+                <w:b w:val="0"/>
+                <w:sz w:val="18"/>
+              </w:rPr>
+              <w:t>OBJ-007</w:t>
+            </w:r>
+          </w:p>
+        </w:tc>
+        <w:tc>
+          <w:tcPr>
+            <w:tcW w:type="dxa" w:w="7860"/>
+            <w:vAlign w:val="center"/>
+          </w:tcPr>
+          <w:p>
+            <w:r>
+              <w:rPr>
+                <w:b w:val="0"/>
+                <w:sz w:val="18"/>
+              </w:rPr>
+              <w:t>Standardize product selection and pricing through a Product master record with Product Name, Notes, Base Price, and Active/Inactive status.</w:t>
+            </w:r>
+          </w:p>
+        </w:tc>
+      </w:tr>
+      <w:tr>
+        <w:tc>
+          <w:tcPr>
+            <w:tcW w:type="dxa" w:w="1500"/>
+            <w:vAlign w:val="center"/>
+          </w:tcPr>
+          <w:p>
+            <w:r>
+              <w:rPr>
+                <w:b w:val="0"/>
+                <w:sz w:val="18"/>
+              </w:rPr>
+              <w:t>OBJ-008</w:t>
+            </w:r>
+          </w:p>
+        </w:tc>
+        <w:tc>
+          <w:tcPr>
+            <w:tcW w:type="dxa" w:w="7860"/>
+            <w:vAlign w:val="center"/>
+          </w:tcPr>
+          <w:p>
+            <w:r>
+              <w:rPr>
+                <w:b w:val="0"/>
+                <w:sz w:val="18"/>
+              </w:rPr>
+              <w:t>Support a separated Pre Order/PO transaction flow that captures PO document evidence, manual PO/Sales Order ID, required product date, and reminder notification while reusing the same downstream revenue-cycle process.</w:t>
+            </w:r>
+          </w:p>
+        </w:tc>
+      </w:tr>
+      <w:tr>
+        <w:tc>
+          <w:tcPr>
+            <w:tcW w:type="dxa" w:w="1500"/>
+            <w:vAlign w:val="center"/>
+          </w:tcPr>
+          <w:p>
+            <w:r>
+              <w:rPr>
+                <w:b w:val="0"/>
+                <w:sz w:val="18"/>
+              </w:rPr>
+              <w:t>OBJ-009</w:t>
+            </w:r>
+          </w:p>
+        </w:tc>
+        <w:tc>
+          <w:tcPr>
+            <w:tcW w:type="dxa" w:w="7860"/>
+            <w:vAlign w:val="center"/>
+          </w:tcPr>
+          <w:p>
+            <w:r>
+              <w:rPr>
+                <w:b w:val="0"/>
+                <w:sz w:val="18"/>
+              </w:rPr>
+              <w:t>Improve operational review by ensuring table sort, filter, and edit behavior works consistently across list pages.</w:t>
             </w:r>
           </w:p>
         </w:tc>
@@ -1841,9 +1990,9 @@
     <w:tbl>
       <w:tblPr>
         <w:tblW w:type="dxa" w:w="9360"/>
-        <w:jc w:val="left"/>
         <w:tblLayout w:type="fixed"/>
         <w:tblLook w:firstColumn="1" w:firstRow="1" w:lastColumn="0" w:lastRow="0" w:noHBand="0" w:noVBand="1" w:val="04A0"/>
+        <w:jc w:val="center"/>
         <w:tblInd w:type="dxa" w:w="120"/>
         <w:tblBorders>
           <w:top w:val="single" w:sz="4" w:space="0" w:color="CBD5E1"/>
@@ -2457,6 +2606,230 @@
           </w:p>
         </w:tc>
       </w:tr>
+      <w:tr>
+        <w:tc>
+          <w:tcPr>
+            <w:tcW w:type="dxa" w:w="2600"/>
+            <w:vAlign w:val="center"/>
+          </w:tcPr>
+          <w:p>
+            <w:r>
+              <w:rPr>
+                <w:b w:val="0"/>
+                <w:sz w:val="18"/>
+              </w:rPr>
+              <w:t>Product data management</w:t>
+            </w:r>
+          </w:p>
+        </w:tc>
+        <w:tc>
+          <w:tcPr>
+            <w:tcW w:type="dxa" w:w="6760"/>
+            <w:vAlign w:val="center"/>
+          </w:tcPr>
+          <w:p>
+            <w:r>
+              <w:rPr>
+                <w:b w:val="0"/>
+                <w:sz w:val="18"/>
+              </w:rPr>
+              <w:t>Create, view, search, sort, filter, edit, and deactivate Product records containing Product Name, Notes, Base Price, and Status.</w:t>
+            </w:r>
+          </w:p>
+        </w:tc>
+      </w:tr>
+      <w:tr>
+        <w:tc>
+          <w:tcPr>
+            <w:tcW w:type="dxa" w:w="2600"/>
+            <w:vAlign w:val="center"/>
+          </w:tcPr>
+          <w:p>
+            <w:r>
+              <w:rPr>
+                <w:b w:val="0"/>
+                <w:sz w:val="18"/>
+              </w:rPr>
+              <w:t>Pre Order / PO management</w:t>
+            </w:r>
+          </w:p>
+        </w:tc>
+        <w:tc>
+          <w:tcPr>
+            <w:tcW w:type="dxa" w:w="6760"/>
+            <w:vAlign w:val="center"/>
+          </w:tcPr>
+          <w:p>
+            <w:r>
+              <w:rPr>
+                <w:b w:val="0"/>
+                <w:sz w:val="18"/>
+              </w:rPr>
+              <w:t>Create and manage Pre Order/PO transactions separately from normal Sales Orders while keeping the same detail, status, approval, invoice, payment, and delivery behavior where applicable.</w:t>
+            </w:r>
+          </w:p>
+        </w:tc>
+      </w:tr>
+      <w:tr>
+        <w:tc>
+          <w:tcPr>
+            <w:tcW w:type="dxa" w:w="2600"/>
+            <w:vAlign w:val="center"/>
+          </w:tcPr>
+          <w:p>
+            <w:r>
+              <w:rPr>
+                <w:b w:val="0"/>
+                <w:sz w:val="18"/>
+              </w:rPr>
+              <w:t>PO document upload</w:t>
+            </w:r>
+          </w:p>
+        </w:tc>
+        <w:tc>
+          <w:tcPr>
+            <w:tcW w:type="dxa" w:w="6760"/>
+            <w:vAlign w:val="center"/>
+          </w:tcPr>
+          <w:p>
+            <w:r>
+              <w:rPr>
+                <w:b w:val="0"/>
+                <w:sz w:val="18"/>
+              </w:rPr>
+              <w:t>Upload PO supporting documents in PDF, JPG, PNG, or Word format and link them to the related Pre Order/PO transaction.</w:t>
+            </w:r>
+          </w:p>
+        </w:tc>
+      </w:tr>
+      <w:tr>
+        <w:tc>
+          <w:tcPr>
+            <w:tcW w:type="dxa" w:w="2600"/>
+            <w:vAlign w:val="center"/>
+          </w:tcPr>
+          <w:p>
+            <w:r>
+              <w:rPr>
+                <w:b w:val="0"/>
+                <w:sz w:val="18"/>
+              </w:rPr>
+              <w:t>Product-based item entry</w:t>
+            </w:r>
+          </w:p>
+        </w:tc>
+        <w:tc>
+          <w:tcPr>
+            <w:tcW w:type="dxa" w:w="6760"/>
+            <w:vAlign w:val="center"/>
+          </w:tcPr>
+          <w:p>
+            <w:r>
+              <w:rPr>
+                <w:b w:val="0"/>
+                <w:sz w:val="18"/>
+              </w:rPr>
+              <w:t>Use Product Name dropdown selection from Product master data in Sales Order and Pre Order item entry; automatically fill Base Price while allowing authorized manual adjustment.</w:t>
+            </w:r>
+          </w:p>
+        </w:tc>
+      </w:tr>
+      <w:tr>
+        <w:tc>
+          <w:tcPr>
+            <w:tcW w:type="dxa" w:w="2600"/>
+            <w:vAlign w:val="center"/>
+          </w:tcPr>
+          <w:p>
+            <w:r>
+              <w:rPr>
+                <w:b w:val="0"/>
+                <w:sz w:val="18"/>
+              </w:rPr>
+              <w:t>Pricing adjustment</w:t>
+            </w:r>
+          </w:p>
+        </w:tc>
+        <w:tc>
+          <w:tcPr>
+            <w:tcW w:type="dxa" w:w="6760"/>
+            <w:vAlign w:val="center"/>
+          </w:tcPr>
+          <w:p>
+            <w:r>
+              <w:rPr>
+                <w:b w:val="0"/>
+                <w:sz w:val="18"/>
+              </w:rPr>
+              <w:t>Support optional Markup and Discount fields that affect Unit Price and are visible only inside the system and Audit Trail, not in printed Invoice or Surat Jalan output.</w:t>
+            </w:r>
+          </w:p>
+        </w:tc>
+      </w:tr>
+      <w:tr>
+        <w:tc>
+          <w:tcPr>
+            <w:tcW w:type="dxa" w:w="2600"/>
+            <w:vAlign w:val="center"/>
+          </w:tcPr>
+          <w:p>
+            <w:r>
+              <w:rPr>
+                <w:b w:val="0"/>
+                <w:sz w:val="18"/>
+              </w:rPr>
+              <w:t>Notification reminder</w:t>
+            </w:r>
+          </w:p>
+        </w:tc>
+        <w:tc>
+          <w:tcPr>
+            <w:tcW w:type="dxa" w:w="6760"/>
+            <w:vAlign w:val="center"/>
+          </w:tcPr>
+          <w:p>
+            <w:r>
+              <w:rPr>
+                <w:b w:val="0"/>
+                <w:sz w:val="18"/>
+              </w:rPr>
+              <w:t>Remind users to process Pre Order/PO transactions before the required product date.</w:t>
+            </w:r>
+          </w:p>
+        </w:tc>
+      </w:tr>
+      <w:tr>
+        <w:tc>
+          <w:tcPr>
+            <w:tcW w:type="dxa" w:w="2600"/>
+            <w:vAlign w:val="center"/>
+          </w:tcPr>
+          <w:p>
+            <w:r>
+              <w:rPr>
+                <w:b w:val="0"/>
+                <w:sz w:val="18"/>
+              </w:rPr>
+              <w:t>Table interaction</w:t>
+            </w:r>
+          </w:p>
+        </w:tc>
+        <w:tc>
+          <w:tcPr>
+            <w:tcW w:type="dxa" w:w="6760"/>
+            <w:vAlign w:val="center"/>
+          </w:tcPr>
+          <w:p>
+            <w:r>
+              <w:rPr>
+                <w:b w:val="0"/>
+                <w:sz w:val="18"/>
+              </w:rPr>
+              <w:t>Provide working sort and filter behavior across operational tables, including product, customer, transaction, invoice, payment, receivable, billing, follow-up, and audit views where available.</w:t>
+            </w:r>
+          </w:p>
+        </w:tc>
+      </w:tr>
     </w:tbl>
     <w:p>
       <w:pPr>
@@ -2474,9 +2847,9 @@
     <w:tbl>
       <w:tblPr>
         <w:tblW w:type="dxa" w:w="9360"/>
-        <w:jc w:val="left"/>
         <w:tblLayout w:type="fixed"/>
         <w:tblLook w:firstColumn="1" w:firstRow="1" w:lastColumn="0" w:lastRow="0" w:noHBand="0" w:noVBand="1" w:val="04A0"/>
+        <w:jc w:val="center"/>
         <w:tblInd w:type="dxa" w:w="120"/>
         <w:tblBorders>
           <w:top w:val="single" w:sz="4" w:space="0" w:color="CBD5E1"/>
@@ -2928,6 +3301,70 @@
           </w:p>
         </w:tc>
       </w:tr>
+      <w:tr>
+        <w:tc>
+          <w:tcPr>
+            <w:tcW w:type="dxa" w:w="2600"/>
+            <w:vAlign w:val="center"/>
+          </w:tcPr>
+          <w:p>
+            <w:r>
+              <w:rPr>
+                <w:b w:val="0"/>
+                <w:sz w:val="18"/>
+              </w:rPr>
+              <w:t>Automated PO document interpretation</w:t>
+            </w:r>
+          </w:p>
+        </w:tc>
+        <w:tc>
+          <w:tcPr>
+            <w:tcW w:type="dxa" w:w="6760"/>
+            <w:vAlign w:val="center"/>
+          </w:tcPr>
+          <w:p>
+            <w:r>
+              <w:rPr>
+                <w:b w:val="0"/>
+                <w:sz w:val="18"/>
+              </w:rPr>
+              <w:t>Uploaded PO documents are stored as supporting evidence; OCR, automatic data extraction, and document understanding are outside current MVP scope.</w:t>
+            </w:r>
+          </w:p>
+        </w:tc>
+      </w:tr>
+      <w:tr>
+        <w:tc>
+          <w:tcPr>
+            <w:tcW w:type="dxa" w:w="2600"/>
+            <w:vAlign w:val="center"/>
+          </w:tcPr>
+          <w:p>
+            <w:r>
+              <w:rPr>
+                <w:b w:val="0"/>
+                <w:sz w:val="18"/>
+              </w:rPr>
+              <w:t>Inventory reservation and production planning</w:t>
+            </w:r>
+          </w:p>
+        </w:tc>
+        <w:tc>
+          <w:tcPr>
+            <w:tcW w:type="dxa" w:w="6760"/>
+            <w:vAlign w:val="center"/>
+          </w:tcPr>
+          <w:p>
+            <w:r>
+              <w:rPr>
+                <w:b w:val="0"/>
+                <w:sz w:val="18"/>
+              </w:rPr>
+              <w:t>The required product date supports transaction processing reminders but does not reserve stock or create production schedules.</w:t>
+            </w:r>
+          </w:p>
+        </w:tc>
+      </w:tr>
     </w:tbl>
     <w:p>
       <w:pPr>
@@ -2945,9 +3382,9 @@
     <w:tbl>
       <w:tblPr>
         <w:tblW w:type="dxa" w:w="9360"/>
-        <w:jc w:val="left"/>
         <w:tblLayout w:type="fixed"/>
         <w:tblLook w:firstColumn="1" w:firstRow="1" w:lastColumn="0" w:lastRow="0" w:noHBand="0" w:noVBand="1" w:val="04A0"/>
+        <w:jc w:val="center"/>
         <w:tblInd w:type="dxa" w:w="120"/>
         <w:tblBorders>
           <w:top w:val="single" w:sz="4" w:space="0" w:color="CBD5E1"/>
@@ -3114,17 +3551,12 @@
             </w:tcMar>
           </w:tcPr>
           <w:p>
-            <w:pPr>
-              <w:spacing w:before="0" w:after="60" w:line="264" w:lineRule="auto"/>
-            </w:pPr>
-            <w:r>
-              <w:rPr>
-                <w:rFonts w:ascii="Calibri" w:hAnsi="Calibri"/>
-                <w:b w:val="0"/>
-                <w:color w:val="1F2937"/>
-                <w:sz w:val="17"/>
-              </w:rPr>
-              <w:t>Can use all current features, review dashboard insight, approve/reject risky sales orders, and review audit evidence.</w:t>
+            <w:r>
+              <w:rPr>
+                <w:b w:val="0"/>
+                <w:sz w:val="18"/>
+              </w:rPr>
+              <w:t>Can use all current features, review dashboard insight, approve/reject risky Sales Orders or Pre Orders, review Product data, review reminder status, and review audit evidence.</w:t>
             </w:r>
           </w:p>
         </w:tc>
@@ -3194,17 +3626,12 @@
             </w:tcMar>
           </w:tcPr>
           <w:p>
-            <w:pPr>
-              <w:spacing w:before="0" w:after="60" w:line="264" w:lineRule="auto"/>
-            </w:pPr>
-            <w:r>
-              <w:rPr>
-                <w:rFonts w:ascii="Calibri" w:hAnsi="Calibri"/>
-                <w:b w:val="0"/>
-                <w:color w:val="1F2937"/>
-                <w:sz w:val="17"/>
-              </w:rPr>
-              <w:t>Can generate invoices, record payments, create Surat Jalan, manage billing/follow-up records, and create local accounts; cannot create Sales Orders.</w:t>
+            <w:r>
+              <w:rPr>
+                <w:b w:val="0"/>
+                <w:sz w:val="18"/>
+              </w:rPr>
+              <w:t>Can manage Product records, generate invoices, record payments, create Surat Jalan, manage billing/follow-up records, process Pre Order/PO documents and reminders, and create local accounts; cannot create Sales Orders unless assigned by business rule.</w:t>
             </w:r>
           </w:p>
         </w:tc>
@@ -3274,17 +3701,12 @@
             </w:tcMar>
           </w:tcPr>
           <w:p>
-            <w:pPr>
-              <w:spacing w:before="0" w:after="60" w:line="264" w:lineRule="auto"/>
-            </w:pPr>
-            <w:r>
-              <w:rPr>
-                <w:rFonts w:ascii="Calibri" w:hAnsi="Calibri"/>
-                <w:b w:val="0"/>
-                <w:color w:val="1F2937"/>
-                <w:sz w:val="17"/>
-              </w:rPr>
-              <w:t>Can manage customers and create Sales Orders; restricted from invoice, payment, Surat Jalan, and account creation actions.</w:t>
+            <w:r>
+              <w:rPr>
+                <w:b w:val="0"/>
+                <w:sz w:val="18"/>
+              </w:rPr>
+              <w:t>Can manage customers, create Sales Orders and Pre Orders/PO transactions, select products from Product master data, upload PO documents, and review transaction status; restricted from invoice, payment, Surat Jalan, and account creation actions.</w:t>
             </w:r>
           </w:p>
         </w:tc>
@@ -3502,20 +3924,79 @@
         <w:spacing w:before="0" w:after="120" w:line="264" w:lineRule="auto"/>
       </w:pPr>
       <w:r>
+        <w:t>The proposed/to-be process uses the system as a centralized local record for key revenue-cycle activities. Customer and Product records become the basis for transactions. When creating a transaction, the user identifies whether it is a normal Sales Order or a Pre Order/PO transaction. Both transaction types share the same downstream invoice, payment, receivable, billing, and Surat Jalan process, while Pre Order/PO additionally records the uploaded PO document, manually entered Sales Order/PO ID, required product date, and reminder notification before the required date.</w:t>
+      </w:r>
+    </w:p>
+    <w:p>
+      <w:pPr>
+        <w:pStyle w:val="Heading1"/>
+      </w:pPr>
+      <w:r>
+        <w:t>Activity Diagram</w:t>
+      </w:r>
+    </w:p>
+    <w:p>
+      <w:r>
+        <w:t>The updated activity diagram summarizes the required flow using simple start/end, activity, swimlane, decision, and arrow components. It separates normal Sales Order and Pre Order/PO at transaction creation, while keeping invoice, payment, receivable, billing, and delivery document processing consistent after the transaction is validated.</w:t>
+      </w:r>
+    </w:p>
+    <w:p>
+      <w:pPr>
+        <w:jc w:val="center"/>
+      </w:pPr>
+      <w:r>
+        <w:drawing>
+          <wp:inline xmlns:a="http://schemas.openxmlformats.org/drawingml/2006/main" xmlns:pic="http://schemas.openxmlformats.org/drawingml/2006/picture">
+            <wp:extent cx="5577840" cy="5093071"/>
+            <wp:docPr id="1" name="Picture 1"/>
+            <wp:cNvGraphicFramePr>
+              <a:graphicFrameLocks noChangeAspect="1"/>
+            </wp:cNvGraphicFramePr>
+            <a:graphic>
+              <a:graphicData uri="http://schemas.openxmlformats.org/drawingml/2006/picture">
+                <pic:pic>
+                  <pic:nvPicPr>
+                    <pic:cNvPr id="0" name="revenue-cycle-activity-diagram.png"/>
+                    <pic:cNvPicPr/>
+                  </pic:nvPicPr>
+                  <pic:blipFill>
+                    <a:blip r:embed="rId10"/>
+                    <a:stretch>
+                      <a:fillRect/>
+                    </a:stretch>
+                  </pic:blipFill>
+                  <pic:spPr>
+                    <a:xfrm>
+                      <a:off x="0" y="0"/>
+                      <a:ext cx="5577840" cy="5093071"/>
+                    </a:xfrm>
+                    <a:prstGeom prst="rect"/>
+                  </pic:spPr>
+                </pic:pic>
+              </a:graphicData>
+            </a:graphic>
+          </wp:inline>
+        </w:drawing>
+      </w:r>
+    </w:p>
+    <w:p>
+      <w:pPr>
+        <w:jc w:val="center"/>
+      </w:pPr>
+      <w:r>
         <w:rPr>
-          <w:rFonts w:ascii="Calibri" w:hAnsi="Calibri"/>
-          <w:color w:val="1F2937"/>
-          <w:sz w:val="22"/>
+          <w:i/>
+          <w:sz w:val="18"/>
         </w:rPr>
-        <w:t>The proposed/to-be process uses the system as a centralized local record for key revenue-cycle activities. A customer record becomes the basis for a Sales Order. The Sales Order stores order items, payment term, approval condition, and transaction total. Eligible orders generate an Invoice; payments are recorded against the Invoice; receivables are derived from invoice balances; Surat Jalan supports delivery documentation; Billing and Follow Up modules support collection and relationship activities; Dashboard and Audit Trail modules provide visibility and traceability.</w:t>
+        <w:t>Figure 1. Activity diagram for the updated revenue-cycle flow, including normal Sales Order, Pre Order/PO, invoice, payment, and Surat Jalan processing.</w:t>
       </w:r>
     </w:p>
     <w:tbl>
       <w:tblPr>
         <w:tblW w:type="dxa" w:w="9360"/>
-        <w:jc w:val="left"/>
         <w:tblLayout w:type="fixed"/>
         <w:tblLook w:firstColumn="1" w:firstRow="1" w:lastColumn="0" w:lastRow="0" w:noHBand="0" w:noVBand="1" w:val="04A0"/>
+        <w:jc w:val="center"/>
         <w:tblInd w:type="dxa" w:w="120"/>
         <w:tblBorders>
           <w:top w:val="single" w:sz="4" w:space="0" w:color="CBD5E1"/>
@@ -3628,14 +4109,9 @@
             </w:tcMar>
           </w:tcPr>
           <w:p>
-            <w:pPr>
-              <w:spacing w:before="0" w:after="60" w:line="264" w:lineRule="auto"/>
-            </w:pPr>
-            <w:r>
-              <w:rPr>
-                <w:rFonts w:ascii="Calibri" w:hAnsi="Calibri"/>
-                <w:b w:val="0"/>
-                <w:color w:val="1F2937"/>
+            <w:r>
+              <w:rPr>
+                <w:b w:val="0"/>
                 <w:sz w:val="18"/>
               </w:rPr>
               <w:t>Customer profile, category, status, payment risk, and transaction history are maintained centrally.</w:t>
@@ -3656,17 +4132,12 @@
             </w:tcMar>
           </w:tcPr>
           <w:p>
-            <w:pPr>
-              <w:spacing w:before="0" w:after="60" w:line="264" w:lineRule="auto"/>
-            </w:pPr>
-            <w:r>
-              <w:rPr>
-                <w:rFonts w:ascii="Calibri" w:hAnsi="Calibri"/>
-                <w:b w:val="0"/>
-                <w:color w:val="1F2937"/>
+            <w:r>
+              <w:rPr>
+                <w:b w:val="0"/>
                 <w:sz w:val="18"/>
               </w:rPr>
-              <w:t>Sales order</w:t>
+              <w:t>Transaction creation</w:t>
             </w:r>
           </w:p>
         </w:tc>
@@ -3682,17 +4153,12 @@
             </w:tcMar>
           </w:tcPr>
           <w:p>
-            <w:pPr>
-              <w:spacing w:before="0" w:after="60" w:line="264" w:lineRule="auto"/>
-            </w:pPr>
-            <w:r>
-              <w:rPr>
-                <w:rFonts w:ascii="Calibri" w:hAnsi="Calibri"/>
-                <w:b w:val="0"/>
-                <w:color w:val="1F2937"/>
+            <w:r>
+              <w:rPr>
+                <w:b w:val="0"/>
                 <w:sz w:val="18"/>
               </w:rPr>
-              <w:t>Order data, items, totals, payment term, and approval status are recorded in a structured flow.</w:t>
+              <w:t>User selects whether the transaction is a normal Sales Order or a Pre Order/PO through a creation prompt.</w:t>
             </w:r>
           </w:p>
         </w:tc>
@@ -4017,6 +4483,198 @@
                 <w:sz w:val="18"/>
               </w:rPr>
               <w:t>Management summary and audit evidence are generated from system activity.</w:t>
+            </w:r>
+          </w:p>
+        </w:tc>
+      </w:tr>
+      <w:tr>
+        <w:tc>
+          <w:tcPr>
+            <w:tcW w:type="dxa" w:w="2300"/>
+            <w:vAlign w:val="center"/>
+          </w:tcPr>
+          <w:p>
+            <w:r>
+              <w:rPr>
+                <w:b w:val="0"/>
+                <w:sz w:val="18"/>
+              </w:rPr>
+              <w:t>Product setup</w:t>
+            </w:r>
+          </w:p>
+        </w:tc>
+        <w:tc>
+          <w:tcPr>
+            <w:tcW w:type="dxa" w:w="7060"/>
+            <w:vAlign w:val="center"/>
+          </w:tcPr>
+          <w:p>
+            <w:r>
+              <w:rPr>
+                <w:b w:val="0"/>
+                <w:sz w:val="18"/>
+              </w:rPr>
+              <w:t>Product Name, Notes, Base Price, and Active/Inactive status are maintained centrally and reused during item entry.</w:t>
+            </w:r>
+          </w:p>
+        </w:tc>
+      </w:tr>
+      <w:tr>
+        <w:tc>
+          <w:tcPr>
+            <w:tcW w:type="dxa" w:w="2300"/>
+            <w:vAlign w:val="center"/>
+          </w:tcPr>
+          <w:p>
+            <w:r>
+              <w:rPr>
+                <w:b w:val="0"/>
+                <w:sz w:val="18"/>
+              </w:rPr>
+              <w:t>Pre Order / PO</w:t>
+            </w:r>
+          </w:p>
+        </w:tc>
+        <w:tc>
+          <w:tcPr>
+            <w:tcW w:type="dxa" w:w="7060"/>
+            <w:vAlign w:val="center"/>
+          </w:tcPr>
+          <w:p>
+            <w:r>
+              <w:rPr>
+                <w:b w:val="0"/>
+                <w:sz w:val="18"/>
+              </w:rPr>
+              <w:t>PO transaction stores uploaded PO document, manually entered PO/Sales Order ID, required product date, transaction type, items, totals, and status.</w:t>
+            </w:r>
+          </w:p>
+        </w:tc>
+      </w:tr>
+      <w:tr>
+        <w:tc>
+          <w:tcPr>
+            <w:tcW w:type="dxa" w:w="2300"/>
+            <w:vAlign w:val="center"/>
+          </w:tcPr>
+          <w:p>
+            <w:r>
+              <w:rPr>
+                <w:b w:val="0"/>
+                <w:sz w:val="18"/>
+              </w:rPr>
+              <w:t>Product pricing</w:t>
+            </w:r>
+          </w:p>
+        </w:tc>
+        <w:tc>
+          <w:tcPr>
+            <w:tcW w:type="dxa" w:w="7060"/>
+            <w:vAlign w:val="center"/>
+          </w:tcPr>
+          <w:p>
+            <w:r>
+              <w:rPr>
+                <w:b w:val="0"/>
+                <w:sz w:val="18"/>
+              </w:rPr>
+              <w:t>Item entry uses Product Name dropdown, auto-fills Base Price, allows Unit Price edits, and applies optional Markup or Discount internally.</w:t>
+            </w:r>
+          </w:p>
+        </w:tc>
+      </w:tr>
+      <w:tr>
+        <w:tc>
+          <w:tcPr>
+            <w:tcW w:type="dxa" w:w="2300"/>
+            <w:vAlign w:val="center"/>
+          </w:tcPr>
+          <w:p>
+            <w:r>
+              <w:rPr>
+                <w:b w:val="0"/>
+                <w:sz w:val="18"/>
+              </w:rPr>
+              <w:t>PO reminder</w:t>
+            </w:r>
+          </w:p>
+        </w:tc>
+        <w:tc>
+          <w:tcPr>
+            <w:tcW w:type="dxa" w:w="7060"/>
+            <w:vAlign w:val="center"/>
+          </w:tcPr>
+          <w:p>
+            <w:r>
+              <w:rPr>
+                <w:b w:val="0"/>
+                <w:sz w:val="18"/>
+              </w:rPr>
+              <w:t>System notifies users before the required product date so PO transactions can be processed on time.</w:t>
+            </w:r>
+          </w:p>
+        </w:tc>
+      </w:tr>
+      <w:tr>
+        <w:tc>
+          <w:tcPr>
+            <w:tcW w:type="dxa" w:w="2300"/>
+            <w:vAlign w:val="center"/>
+          </w:tcPr>
+          <w:p>
+            <w:r>
+              <w:rPr>
+                <w:b w:val="0"/>
+                <w:sz w:val="18"/>
+              </w:rPr>
+              <w:t>Printed documents</w:t>
+            </w:r>
+          </w:p>
+        </w:tc>
+        <w:tc>
+          <w:tcPr>
+            <w:tcW w:type="dxa" w:w="7060"/>
+            <w:vAlign w:val="center"/>
+          </w:tcPr>
+          <w:p>
+            <w:r>
+              <w:rPr>
+                <w:b w:val="0"/>
+                <w:sz w:val="18"/>
+              </w:rPr>
+              <w:t>Invoice and Surat Jalan show transaction type and PO details when relevant, but exclude internal markup/discount fields.</w:t>
+            </w:r>
+          </w:p>
+        </w:tc>
+      </w:tr>
+      <w:tr>
+        <w:tc>
+          <w:tcPr>
+            <w:tcW w:type="dxa" w:w="2300"/>
+            <w:vAlign w:val="center"/>
+          </w:tcPr>
+          <w:p>
+            <w:r>
+              <w:rPr>
+                <w:b w:val="0"/>
+                <w:sz w:val="18"/>
+              </w:rPr>
+              <w:t>Table review</w:t>
+            </w:r>
+          </w:p>
+        </w:tc>
+        <w:tc>
+          <w:tcPr>
+            <w:tcW w:type="dxa" w:w="7060"/>
+            <w:vAlign w:val="center"/>
+          </w:tcPr>
+          <w:p>
+            <w:r>
+              <w:rPr>
+                <w:b w:val="0"/>
+                <w:sz w:val="18"/>
+              </w:rPr>
+              <w:t>Operational tables support working sort and filter behavior to help users find and review records.</w:t>
             </w:r>
           </w:p>
         </w:tc>
@@ -4038,9 +4696,9 @@
     <w:tbl>
       <w:tblPr>
         <w:tblW w:type="dxa" w:w="9360"/>
-        <w:jc w:val="left"/>
         <w:tblLayout w:type="fixed"/>
         <w:tblLook w:firstColumn="1" w:firstRow="1" w:lastColumn="0" w:lastRow="0" w:noHBand="0" w:noVBand="1" w:val="04A0"/>
+        <w:jc w:val="center"/>
         <w:tblInd w:type="dxa" w:w="120"/>
         <w:tblBorders>
           <w:top w:val="single" w:sz="4" w:space="0" w:color="CBD5E1"/>
@@ -4369,17 +5027,12 @@
             </w:tcMar>
           </w:tcPr>
           <w:p>
-            <w:pPr>
-              <w:spacing w:before="0" w:after="60" w:line="264" w:lineRule="auto"/>
-            </w:pPr>
-            <w:r>
-              <w:rPr>
-                <w:rFonts w:ascii="Calibri" w:hAnsi="Calibri"/>
-                <w:b w:val="0"/>
-                <w:color w:val="1F2937"/>
-                <w:sz w:val="17"/>
-              </w:rPr>
-              <w:t>The system shall support Sales Order creation with customer, item, quantity, price, total, and payment-term data.</w:t>
+            <w:r>
+              <w:rPr>
+                <w:b w:val="0"/>
+                <w:sz w:val="18"/>
+              </w:rPr>
+              <w:t>The system shall support Sales Order creation with customer, Product Name, quantity, unit price, optional internal markup/discount, total, and payment-term data.</w:t>
             </w:r>
           </w:p>
         </w:tc>
@@ -4395,17 +5048,12 @@
             </w:tcMar>
           </w:tcPr>
           <w:p>
-            <w:pPr>
-              <w:spacing w:before="0" w:after="60" w:line="264" w:lineRule="auto"/>
-            </w:pPr>
-            <w:r>
-              <w:rPr>
-                <w:rFonts w:ascii="Calibri" w:hAnsi="Calibri"/>
-                <w:b w:val="0"/>
-                <w:color w:val="1F2937"/>
-                <w:sz w:val="17"/>
-              </w:rPr>
-              <w:t>A standardized Sales Order is needed as the starting point for traceable revenue-cycle transactions.</w:t>
+            <w:r>
+              <w:rPr>
+                <w:b w:val="0"/>
+                <w:sz w:val="18"/>
+              </w:rPr>
+              <w:t>A standardized Sales Order is needed as the starting point for traceable revenue-cycle transactions while reducing inconsistent free-text item entry.</w:t>
             </w:r>
           </w:p>
         </w:tc>
@@ -6042,6 +6690,930 @@
                 <w:sz w:val="17"/>
               </w:rPr>
               <w:t>Overall MVP</w:t>
+            </w:r>
+          </w:p>
+        </w:tc>
+      </w:tr>
+      <w:tr>
+        <w:tc>
+          <w:tcPr>
+            <w:tcW w:type="dxa" w:w="900"/>
+            <w:vAlign w:val="center"/>
+          </w:tcPr>
+          <w:p>
+            <w:r>
+              <w:rPr>
+                <w:b w:val="0"/>
+                <w:sz w:val="18"/>
+              </w:rPr>
+              <w:t>BR-015</w:t>
+            </w:r>
+          </w:p>
+        </w:tc>
+        <w:tc>
+          <w:tcPr>
+            <w:tcW w:type="dxa" w:w="2850"/>
+            <w:vAlign w:val="center"/>
+          </w:tcPr>
+          <w:p>
+            <w:r>
+              <w:rPr>
+                <w:b w:val="0"/>
+                <w:sz w:val="18"/>
+              </w:rPr>
+              <w:t>The system shall maintain Product master data with Product Name, Notes, Base Price, and Active/Inactive status.</w:t>
+            </w:r>
+          </w:p>
+        </w:tc>
+        <w:tc>
+          <w:tcPr>
+            <w:tcW w:type="dxa" w:w="3500"/>
+            <w:vAlign w:val="center"/>
+          </w:tcPr>
+          <w:p>
+            <w:r>
+              <w:rPr>
+                <w:b w:val="0"/>
+                <w:sz w:val="18"/>
+              </w:rPr>
+              <w:t>Product master data standardizes item naming and base pricing across Sales Order and Pre Order transactions.</w:t>
+            </w:r>
+          </w:p>
+        </w:tc>
+        <w:tc>
+          <w:tcPr>
+            <w:tcW w:type="dxa" w:w="850"/>
+            <w:vAlign w:val="center"/>
+          </w:tcPr>
+          <w:p>
+            <w:r>
+              <w:rPr>
+                <w:b w:val="0"/>
+                <w:sz w:val="18"/>
+              </w:rPr>
+              <w:t>High</w:t>
+            </w:r>
+          </w:p>
+        </w:tc>
+        <w:tc>
+          <w:tcPr>
+            <w:tcW w:type="dxa" w:w="1260"/>
+            <w:vAlign w:val="center"/>
+          </w:tcPr>
+          <w:p>
+            <w:r>
+              <w:rPr>
+                <w:b w:val="0"/>
+                <w:sz w:val="18"/>
+              </w:rPr>
+              <w:t>Products</w:t>
+            </w:r>
+          </w:p>
+        </w:tc>
+      </w:tr>
+      <w:tr>
+        <w:tc>
+          <w:tcPr>
+            <w:tcW w:type="dxa" w:w="900"/>
+            <w:vAlign w:val="center"/>
+          </w:tcPr>
+          <w:p>
+            <w:r>
+              <w:rPr>
+                <w:b w:val="0"/>
+                <w:sz w:val="18"/>
+              </w:rPr>
+              <w:t>BR-016</w:t>
+            </w:r>
+          </w:p>
+        </w:tc>
+        <w:tc>
+          <w:tcPr>
+            <w:tcW w:type="dxa" w:w="2850"/>
+            <w:vAlign w:val="center"/>
+          </w:tcPr>
+          <w:p>
+            <w:r>
+              <w:rPr>
+                <w:b w:val="0"/>
+                <w:sz w:val="18"/>
+              </w:rPr>
+              <w:t>The system shall provide a Product menu in the left navigation with list, detail, add, edit, search, sort, filter, and inactive behavior similar to Customer management.</w:t>
+            </w:r>
+          </w:p>
+        </w:tc>
+        <w:tc>
+          <w:tcPr>
+            <w:tcW w:type="dxa" w:w="3500"/>
+            <w:vAlign w:val="center"/>
+          </w:tcPr>
+          <w:p>
+            <w:r>
+              <w:rPr>
+                <w:b w:val="0"/>
+                <w:sz w:val="18"/>
+              </w:rPr>
+              <w:t>Consistent product management behavior reduces user learning effort and improves data quality.</w:t>
+            </w:r>
+          </w:p>
+        </w:tc>
+        <w:tc>
+          <w:tcPr>
+            <w:tcW w:type="dxa" w:w="850"/>
+            <w:vAlign w:val="center"/>
+          </w:tcPr>
+          <w:p>
+            <w:r>
+              <w:rPr>
+                <w:b w:val="0"/>
+                <w:sz w:val="18"/>
+              </w:rPr>
+              <w:t>High</w:t>
+            </w:r>
+          </w:p>
+        </w:tc>
+        <w:tc>
+          <w:tcPr>
+            <w:tcW w:type="dxa" w:w="1260"/>
+            <w:vAlign w:val="center"/>
+          </w:tcPr>
+          <w:p>
+            <w:r>
+              <w:rPr>
+                <w:b w:val="0"/>
+                <w:sz w:val="18"/>
+              </w:rPr>
+              <w:t>Products</w:t>
+            </w:r>
+          </w:p>
+        </w:tc>
+      </w:tr>
+      <w:tr>
+        <w:tc>
+          <w:tcPr>
+            <w:tcW w:type="dxa" w:w="900"/>
+            <w:vAlign w:val="center"/>
+          </w:tcPr>
+          <w:p>
+            <w:r>
+              <w:rPr>
+                <w:b w:val="0"/>
+                <w:sz w:val="18"/>
+              </w:rPr>
+              <w:t>BR-017</w:t>
+            </w:r>
+          </w:p>
+        </w:tc>
+        <w:tc>
+          <w:tcPr>
+            <w:tcW w:type="dxa" w:w="2850"/>
+            <w:vAlign w:val="center"/>
+          </w:tcPr>
+          <w:p>
+            <w:r>
+              <w:rPr>
+                <w:b w:val="0"/>
+                <w:sz w:val="18"/>
+              </w:rPr>
+              <w:t>The system shall ask users whether a new transaction is a normal Sales Order or a Pre Order/PO transaction.</w:t>
+            </w:r>
+          </w:p>
+        </w:tc>
+        <w:tc>
+          <w:tcPr>
+            <w:tcW w:type="dxa" w:w="3500"/>
+            <w:vAlign w:val="center"/>
+          </w:tcPr>
+          <w:p>
+            <w:r>
+              <w:rPr>
+                <w:b w:val="0"/>
+                <w:sz w:val="18"/>
+              </w:rPr>
+              <w:t>The transaction type must be clear before collecting required fields and applying the correct workflow.</w:t>
+            </w:r>
+          </w:p>
+        </w:tc>
+        <w:tc>
+          <w:tcPr>
+            <w:tcW w:type="dxa" w:w="850"/>
+            <w:vAlign w:val="center"/>
+          </w:tcPr>
+          <w:p>
+            <w:r>
+              <w:rPr>
+                <w:b w:val="0"/>
+                <w:sz w:val="18"/>
+              </w:rPr>
+              <w:t>High</w:t>
+            </w:r>
+          </w:p>
+        </w:tc>
+        <w:tc>
+          <w:tcPr>
+            <w:tcW w:type="dxa" w:w="1260"/>
+            <w:vAlign w:val="center"/>
+          </w:tcPr>
+          <w:p>
+            <w:r>
+              <w:rPr>
+                <w:b w:val="0"/>
+                <w:sz w:val="18"/>
+              </w:rPr>
+              <w:t>Sales Orders / Pre Orders</w:t>
+            </w:r>
+          </w:p>
+        </w:tc>
+      </w:tr>
+      <w:tr>
+        <w:tc>
+          <w:tcPr>
+            <w:tcW w:type="dxa" w:w="900"/>
+            <w:vAlign w:val="center"/>
+          </w:tcPr>
+          <w:p>
+            <w:r>
+              <w:rPr>
+                <w:b w:val="0"/>
+                <w:sz w:val="18"/>
+              </w:rPr>
+              <w:t>BR-018</w:t>
+            </w:r>
+          </w:p>
+        </w:tc>
+        <w:tc>
+          <w:tcPr>
+            <w:tcW w:type="dxa" w:w="2850"/>
+            <w:vAlign w:val="center"/>
+          </w:tcPr>
+          <w:p>
+            <w:r>
+              <w:rPr>
+                <w:b w:val="0"/>
+                <w:sz w:val="18"/>
+              </w:rPr>
+              <w:t>The system shall maintain Pre Order/PO transactions in a separate left-navigation menu while preserving the same downstream invoice, payment, receivable, billing, and Surat Jalan behavior as Sales Orders.</w:t>
+            </w:r>
+          </w:p>
+        </w:tc>
+        <w:tc>
+          <w:tcPr>
+            <w:tcW w:type="dxa" w:w="3500"/>
+            <w:vAlign w:val="center"/>
+          </w:tcPr>
+          <w:p>
+            <w:r>
+              <w:rPr>
+                <w:b w:val="0"/>
+                <w:sz w:val="18"/>
+              </w:rPr>
+              <w:t>PO transactions need separate monitoring but should not duplicate the downstream revenue-cycle process.</w:t>
+            </w:r>
+          </w:p>
+        </w:tc>
+        <w:tc>
+          <w:tcPr>
+            <w:tcW w:type="dxa" w:w="850"/>
+            <w:vAlign w:val="center"/>
+          </w:tcPr>
+          <w:p>
+            <w:r>
+              <w:rPr>
+                <w:b w:val="0"/>
+                <w:sz w:val="18"/>
+              </w:rPr>
+              <w:t>High</w:t>
+            </w:r>
+          </w:p>
+        </w:tc>
+        <w:tc>
+          <w:tcPr>
+            <w:tcW w:type="dxa" w:w="1260"/>
+            <w:vAlign w:val="center"/>
+          </w:tcPr>
+          <w:p>
+            <w:r>
+              <w:rPr>
+                <w:b w:val="0"/>
+                <w:sz w:val="18"/>
+              </w:rPr>
+              <w:t>Pre Orders</w:t>
+            </w:r>
+          </w:p>
+        </w:tc>
+      </w:tr>
+      <w:tr>
+        <w:tc>
+          <w:tcPr>
+            <w:tcW w:type="dxa" w:w="900"/>
+            <w:vAlign w:val="center"/>
+          </w:tcPr>
+          <w:p>
+            <w:r>
+              <w:rPr>
+                <w:b w:val="0"/>
+                <w:sz w:val="18"/>
+              </w:rPr>
+              <w:t>BR-019</w:t>
+            </w:r>
+          </w:p>
+        </w:tc>
+        <w:tc>
+          <w:tcPr>
+            <w:tcW w:type="dxa" w:w="2850"/>
+            <w:vAlign w:val="center"/>
+          </w:tcPr>
+          <w:p>
+            <w:r>
+              <w:rPr>
+                <w:b w:val="0"/>
+                <w:sz w:val="18"/>
+              </w:rPr>
+              <w:t>The system shall capture PO document upload, manual PO/Sales Order ID, and required product date for Pre Order/PO transactions.</w:t>
+            </w:r>
+          </w:p>
+        </w:tc>
+        <w:tc>
+          <w:tcPr>
+            <w:tcW w:type="dxa" w:w="3500"/>
+            <w:vAlign w:val="center"/>
+          </w:tcPr>
+          <w:p>
+            <w:r>
+              <w:rPr>
+                <w:b w:val="0"/>
+                <w:sz w:val="18"/>
+              </w:rPr>
+              <w:t>PO evidence, manual reference numbers, and required dates are needed to process customer PO transactions correctly.</w:t>
+            </w:r>
+          </w:p>
+        </w:tc>
+        <w:tc>
+          <w:tcPr>
+            <w:tcW w:type="dxa" w:w="850"/>
+            <w:vAlign w:val="center"/>
+          </w:tcPr>
+          <w:p>
+            <w:r>
+              <w:rPr>
+                <w:b w:val="0"/>
+                <w:sz w:val="18"/>
+              </w:rPr>
+              <w:t>High</w:t>
+            </w:r>
+          </w:p>
+        </w:tc>
+        <w:tc>
+          <w:tcPr>
+            <w:tcW w:type="dxa" w:w="1260"/>
+            <w:vAlign w:val="center"/>
+          </w:tcPr>
+          <w:p>
+            <w:r>
+              <w:rPr>
+                <w:b w:val="0"/>
+                <w:sz w:val="18"/>
+              </w:rPr>
+              <w:t>Pre Orders</w:t>
+            </w:r>
+          </w:p>
+        </w:tc>
+      </w:tr>
+      <w:tr>
+        <w:tc>
+          <w:tcPr>
+            <w:tcW w:type="dxa" w:w="900"/>
+            <w:vAlign w:val="center"/>
+          </w:tcPr>
+          <w:p>
+            <w:r>
+              <w:rPr>
+                <w:b w:val="0"/>
+                <w:sz w:val="18"/>
+              </w:rPr>
+              <w:t>BR-020</w:t>
+            </w:r>
+          </w:p>
+        </w:tc>
+        <w:tc>
+          <w:tcPr>
+            <w:tcW w:type="dxa" w:w="2850"/>
+            <w:vAlign w:val="center"/>
+          </w:tcPr>
+          <w:p>
+            <w:r>
+              <w:rPr>
+                <w:b w:val="0"/>
+                <w:sz w:val="18"/>
+              </w:rPr>
+              <w:t>The system shall use Product Name dropdown selection from Product master data for item entry in Sales Order and Pre Order transactions.</w:t>
+            </w:r>
+          </w:p>
+        </w:tc>
+        <w:tc>
+          <w:tcPr>
+            <w:tcW w:type="dxa" w:w="3500"/>
+            <w:vAlign w:val="center"/>
+          </w:tcPr>
+          <w:p>
+            <w:r>
+              <w:rPr>
+                <w:b w:val="0"/>
+                <w:sz w:val="18"/>
+              </w:rPr>
+              <w:t>Dropdown selection improves consistency and enables automatic base-price filling.</w:t>
+            </w:r>
+          </w:p>
+        </w:tc>
+        <w:tc>
+          <w:tcPr>
+            <w:tcW w:type="dxa" w:w="850"/>
+            <w:vAlign w:val="center"/>
+          </w:tcPr>
+          <w:p>
+            <w:r>
+              <w:rPr>
+                <w:b w:val="0"/>
+                <w:sz w:val="18"/>
+              </w:rPr>
+              <w:t>High</w:t>
+            </w:r>
+          </w:p>
+        </w:tc>
+        <w:tc>
+          <w:tcPr>
+            <w:tcW w:type="dxa" w:w="1260"/>
+            <w:vAlign w:val="center"/>
+          </w:tcPr>
+          <w:p>
+            <w:r>
+              <w:rPr>
+                <w:b w:val="0"/>
+                <w:sz w:val="18"/>
+              </w:rPr>
+              <w:t>Sales Orders / Pre Orders / Products</w:t>
+            </w:r>
+          </w:p>
+        </w:tc>
+      </w:tr>
+      <w:tr>
+        <w:tc>
+          <w:tcPr>
+            <w:tcW w:type="dxa" w:w="900"/>
+            <w:vAlign w:val="center"/>
+          </w:tcPr>
+          <w:p>
+            <w:r>
+              <w:rPr>
+                <w:b w:val="0"/>
+                <w:sz w:val="18"/>
+              </w:rPr>
+              <w:t>BR-021</w:t>
+            </w:r>
+          </w:p>
+        </w:tc>
+        <w:tc>
+          <w:tcPr>
+            <w:tcW w:type="dxa" w:w="2850"/>
+            <w:vAlign w:val="center"/>
+          </w:tcPr>
+          <w:p>
+            <w:r>
+              <w:rPr>
+                <w:b w:val="0"/>
+                <w:sz w:val="18"/>
+              </w:rPr>
+              <w:t>The system shall automatically fill Unit Price from Product Base Price while allowing the Unit Price to be edited before saving.</w:t>
+            </w:r>
+          </w:p>
+        </w:tc>
+        <w:tc>
+          <w:tcPr>
+            <w:tcW w:type="dxa" w:w="3500"/>
+            <w:vAlign w:val="center"/>
+          </w:tcPr>
+          <w:p>
+            <w:r>
+              <w:rPr>
+                <w:b w:val="0"/>
+                <w:sz w:val="18"/>
+              </w:rPr>
+              <w:t>Users need a default price for speed but still require flexibility for transaction-specific pricing.</w:t>
+            </w:r>
+          </w:p>
+        </w:tc>
+        <w:tc>
+          <w:tcPr>
+            <w:tcW w:type="dxa" w:w="850"/>
+            <w:vAlign w:val="center"/>
+          </w:tcPr>
+          <w:p>
+            <w:r>
+              <w:rPr>
+                <w:b w:val="0"/>
+                <w:sz w:val="18"/>
+              </w:rPr>
+              <w:t>High</w:t>
+            </w:r>
+          </w:p>
+        </w:tc>
+        <w:tc>
+          <w:tcPr>
+            <w:tcW w:type="dxa" w:w="1260"/>
+            <w:vAlign w:val="center"/>
+          </w:tcPr>
+          <w:p>
+            <w:r>
+              <w:rPr>
+                <w:b w:val="0"/>
+                <w:sz w:val="18"/>
+              </w:rPr>
+              <w:t>Pricing</w:t>
+            </w:r>
+          </w:p>
+        </w:tc>
+      </w:tr>
+      <w:tr>
+        <w:tc>
+          <w:tcPr>
+            <w:tcW w:type="dxa" w:w="900"/>
+            <w:vAlign w:val="center"/>
+          </w:tcPr>
+          <w:p>
+            <w:r>
+              <w:rPr>
+                <w:b w:val="0"/>
+                <w:sz w:val="18"/>
+              </w:rPr>
+              <w:t>BR-022</w:t>
+            </w:r>
+          </w:p>
+        </w:tc>
+        <w:tc>
+          <w:tcPr>
+            <w:tcW w:type="dxa" w:w="2850"/>
+            <w:vAlign w:val="center"/>
+          </w:tcPr>
+          <w:p>
+            <w:r>
+              <w:rPr>
+                <w:b w:val="0"/>
+                <w:sz w:val="18"/>
+              </w:rPr>
+              <w:t>The system shall support optional Markup and Discount fields that affect Unit Price and are recorded in the system and Audit Trail only.</w:t>
+            </w:r>
+          </w:p>
+        </w:tc>
+        <w:tc>
+          <w:tcPr>
+            <w:tcW w:type="dxa" w:w="3500"/>
+            <w:vAlign w:val="center"/>
+          </w:tcPr>
+          <w:p>
+            <w:r>
+              <w:rPr>
+                <w:b w:val="0"/>
+                <w:sz w:val="18"/>
+              </w:rPr>
+              <w:t>Internal pricing adjustments need traceability without exposing markup/discount details on customer-facing documents.</w:t>
+            </w:r>
+          </w:p>
+        </w:tc>
+        <w:tc>
+          <w:tcPr>
+            <w:tcW w:type="dxa" w:w="850"/>
+            <w:vAlign w:val="center"/>
+          </w:tcPr>
+          <w:p>
+            <w:r>
+              <w:rPr>
+                <w:b w:val="0"/>
+                <w:sz w:val="18"/>
+              </w:rPr>
+              <w:t>Medium</w:t>
+            </w:r>
+          </w:p>
+        </w:tc>
+        <w:tc>
+          <w:tcPr>
+            <w:tcW w:type="dxa" w:w="1260"/>
+            <w:vAlign w:val="center"/>
+          </w:tcPr>
+          <w:p>
+            <w:r>
+              <w:rPr>
+                <w:b w:val="0"/>
+                <w:sz w:val="18"/>
+              </w:rPr>
+              <w:t>Pricing / Audit Trail</w:t>
+            </w:r>
+          </w:p>
+        </w:tc>
+      </w:tr>
+      <w:tr>
+        <w:tc>
+          <w:tcPr>
+            <w:tcW w:type="dxa" w:w="900"/>
+            <w:vAlign w:val="center"/>
+          </w:tcPr>
+          <w:p>
+            <w:r>
+              <w:rPr>
+                <w:b w:val="0"/>
+                <w:sz w:val="18"/>
+              </w:rPr>
+              <w:t>BR-023</w:t>
+            </w:r>
+          </w:p>
+        </w:tc>
+        <w:tc>
+          <w:tcPr>
+            <w:tcW w:type="dxa" w:w="2850"/>
+            <w:vAlign w:val="center"/>
+          </w:tcPr>
+          <w:p>
+            <w:r>
+              <w:rPr>
+                <w:b w:val="0"/>
+                <w:sz w:val="18"/>
+              </w:rPr>
+              <w:t>The system shall show a tooltip near Unit Price indicating the selected customer category.</w:t>
+            </w:r>
+          </w:p>
+        </w:tc>
+        <w:tc>
+          <w:tcPr>
+            <w:tcW w:type="dxa" w:w="3500"/>
+            <w:vAlign w:val="center"/>
+          </w:tcPr>
+          <w:p>
+            <w:r>
+              <w:rPr>
+                <w:b w:val="0"/>
+                <w:sz w:val="18"/>
+              </w:rPr>
+              <w:t>Customer category context helps users evaluate pricing decisions during transaction entry.</w:t>
+            </w:r>
+          </w:p>
+        </w:tc>
+        <w:tc>
+          <w:tcPr>
+            <w:tcW w:type="dxa" w:w="850"/>
+            <w:vAlign w:val="center"/>
+          </w:tcPr>
+          <w:p>
+            <w:r>
+              <w:rPr>
+                <w:b w:val="0"/>
+                <w:sz w:val="18"/>
+              </w:rPr>
+              <w:t>Low</w:t>
+            </w:r>
+          </w:p>
+        </w:tc>
+        <w:tc>
+          <w:tcPr>
+            <w:tcW w:type="dxa" w:w="1260"/>
+            <w:vAlign w:val="center"/>
+          </w:tcPr>
+          <w:p>
+            <w:r>
+              <w:rPr>
+                <w:b w:val="0"/>
+                <w:sz w:val="18"/>
+              </w:rPr>
+              <w:t>Pricing / Customers</w:t>
+            </w:r>
+          </w:p>
+        </w:tc>
+      </w:tr>
+      <w:tr>
+        <w:tc>
+          <w:tcPr>
+            <w:tcW w:type="dxa" w:w="900"/>
+            <w:vAlign w:val="center"/>
+          </w:tcPr>
+          <w:p>
+            <w:r>
+              <w:rPr>
+                <w:b w:val="0"/>
+                <w:sz w:val="18"/>
+              </w:rPr>
+              <w:t>BR-024</w:t>
+            </w:r>
+          </w:p>
+        </w:tc>
+        <w:tc>
+          <w:tcPr>
+            <w:tcW w:type="dxa" w:w="2850"/>
+            <w:vAlign w:val="center"/>
+          </w:tcPr>
+          <w:p>
+            <w:r>
+              <w:rPr>
+                <w:b w:val="0"/>
+                <w:sz w:val="18"/>
+              </w:rPr>
+              <w:t>The system shall include transaction type and relevant PO details in printed Invoice and Surat Jalan output.</w:t>
+            </w:r>
+          </w:p>
+        </w:tc>
+        <w:tc>
+          <w:tcPr>
+            <w:tcW w:type="dxa" w:w="3500"/>
+            <w:vAlign w:val="center"/>
+          </w:tcPr>
+          <w:p>
+            <w:r>
+              <w:rPr>
+                <w:b w:val="0"/>
+                <w:sz w:val="18"/>
+              </w:rPr>
+              <w:t>Printed documents must clearly identify whether the transaction is a normal Sales Order or Pre Order/PO and show PO reference details when applicable.</w:t>
+            </w:r>
+          </w:p>
+        </w:tc>
+        <w:tc>
+          <w:tcPr>
+            <w:tcW w:type="dxa" w:w="850"/>
+            <w:vAlign w:val="center"/>
+          </w:tcPr>
+          <w:p>
+            <w:r>
+              <w:rPr>
+                <w:b w:val="0"/>
+                <w:sz w:val="18"/>
+              </w:rPr>
+              <w:t>High</w:t>
+            </w:r>
+          </w:p>
+        </w:tc>
+        <w:tc>
+          <w:tcPr>
+            <w:tcW w:type="dxa" w:w="1260"/>
+            <w:vAlign w:val="center"/>
+          </w:tcPr>
+          <w:p>
+            <w:r>
+              <w:rPr>
+                <w:b w:val="0"/>
+                <w:sz w:val="18"/>
+              </w:rPr>
+              <w:t>Invoices / Surat Jalan</w:t>
+            </w:r>
+          </w:p>
+        </w:tc>
+      </w:tr>
+      <w:tr>
+        <w:tc>
+          <w:tcPr>
+            <w:tcW w:type="dxa" w:w="900"/>
+            <w:vAlign w:val="center"/>
+          </w:tcPr>
+          <w:p>
+            <w:r>
+              <w:rPr>
+                <w:b w:val="0"/>
+                <w:sz w:val="18"/>
+              </w:rPr>
+              <w:t>BR-025</w:t>
+            </w:r>
+          </w:p>
+        </w:tc>
+        <w:tc>
+          <w:tcPr>
+            <w:tcW w:type="dxa" w:w="2850"/>
+            <w:vAlign w:val="center"/>
+          </w:tcPr>
+          <w:p>
+            <w:r>
+              <w:rPr>
+                <w:b w:val="0"/>
+                <w:sz w:val="18"/>
+              </w:rPr>
+              <w:t>The system shall notify users before a Pre Order/PO required product date arrives.</w:t>
+            </w:r>
+          </w:p>
+        </w:tc>
+        <w:tc>
+          <w:tcPr>
+            <w:tcW w:type="dxa" w:w="3500"/>
+            <w:vAlign w:val="center"/>
+          </w:tcPr>
+          <w:p>
+            <w:r>
+              <w:rPr>
+                <w:b w:val="0"/>
+                <w:sz w:val="18"/>
+              </w:rPr>
+              <w:t>Reminder notifications reduce the risk of late PO processing.</w:t>
+            </w:r>
+          </w:p>
+        </w:tc>
+        <w:tc>
+          <w:tcPr>
+            <w:tcW w:type="dxa" w:w="850"/>
+            <w:vAlign w:val="center"/>
+          </w:tcPr>
+          <w:p>
+            <w:r>
+              <w:rPr>
+                <w:b w:val="0"/>
+                <w:sz w:val="18"/>
+              </w:rPr>
+              <w:t>Medium</w:t>
+            </w:r>
+          </w:p>
+        </w:tc>
+        <w:tc>
+          <w:tcPr>
+            <w:tcW w:type="dxa" w:w="1260"/>
+            <w:vAlign w:val="center"/>
+          </w:tcPr>
+          <w:p>
+            <w:r>
+              <w:rPr>
+                <w:b w:val="0"/>
+                <w:sz w:val="18"/>
+              </w:rPr>
+              <w:t>Notifications / Pre Orders</w:t>
+            </w:r>
+          </w:p>
+        </w:tc>
+      </w:tr>
+      <w:tr>
+        <w:tc>
+          <w:tcPr>
+            <w:tcW w:type="dxa" w:w="900"/>
+            <w:vAlign w:val="center"/>
+          </w:tcPr>
+          <w:p>
+            <w:r>
+              <w:rPr>
+                <w:b w:val="0"/>
+                <w:sz w:val="18"/>
+              </w:rPr>
+              <w:t>BR-026</w:t>
+            </w:r>
+          </w:p>
+        </w:tc>
+        <w:tc>
+          <w:tcPr>
+            <w:tcW w:type="dxa" w:w="2850"/>
+            <w:vAlign w:val="center"/>
+          </w:tcPr>
+          <w:p>
+            <w:r>
+              <w:rPr>
+                <w:b w:val="0"/>
+                <w:sz w:val="18"/>
+              </w:rPr>
+              <w:t>The system shall provide working sort and filter controls across all operational tables where those controls are displayed.</w:t>
+            </w:r>
+          </w:p>
+        </w:tc>
+        <w:tc>
+          <w:tcPr>
+            <w:tcW w:type="dxa" w:w="3500"/>
+            <w:vAlign w:val="center"/>
+          </w:tcPr>
+          <w:p>
+            <w:r>
+              <w:rPr>
+                <w:b w:val="0"/>
+                <w:sz w:val="18"/>
+              </w:rPr>
+              <w:t>Table interaction must support practical record review rather than presenting inactive UI controls.</w:t>
+            </w:r>
+          </w:p>
+        </w:tc>
+        <w:tc>
+          <w:tcPr>
+            <w:tcW w:type="dxa" w:w="850"/>
+            <w:vAlign w:val="center"/>
+          </w:tcPr>
+          <w:p>
+            <w:r>
+              <w:rPr>
+                <w:b w:val="0"/>
+                <w:sz w:val="18"/>
+              </w:rPr>
+              <w:t>Medium</w:t>
+            </w:r>
+          </w:p>
+        </w:tc>
+        <w:tc>
+          <w:tcPr>
+            <w:tcW w:type="dxa" w:w="1260"/>
+            <w:vAlign w:val="center"/>
+          </w:tcPr>
+          <w:p>
+            <w:r>
+              <w:rPr>
+                <w:b w:val="0"/>
+                <w:sz w:val="18"/>
+              </w:rPr>
+              <w:t>Tables / UX</w:t>
             </w:r>
           </w:p>
         </w:tc>
@@ -6063,9 +7635,9 @@
     <w:tbl>
       <w:tblPr>
         <w:tblW w:type="dxa" w:w="9360"/>
-        <w:jc w:val="left"/>
         <w:tblLayout w:type="fixed"/>
         <w:tblLook w:firstColumn="1" w:firstRow="1" w:lastColumn="0" w:lastRow="0" w:noHBand="0" w:noVBand="1" w:val="04A0"/>
+        <w:jc w:val="center"/>
         <w:tblInd w:type="dxa" w:w="120"/>
         <w:tblBorders>
           <w:top w:val="single" w:sz="4" w:space="0" w:color="CBD5E1"/>
@@ -6571,6 +8143,166 @@
           </w:p>
         </w:tc>
       </w:tr>
+      <w:tr>
+        <w:tc>
+          <w:tcPr>
+            <w:tcW w:type="dxa" w:w="2400"/>
+            <w:vAlign w:val="center"/>
+          </w:tcPr>
+          <w:p>
+            <w:r>
+              <w:rPr>
+                <w:b w:val="0"/>
+                <w:sz w:val="18"/>
+              </w:rPr>
+              <w:t>Product management</w:t>
+            </w:r>
+          </w:p>
+        </w:tc>
+        <w:tc>
+          <w:tcPr>
+            <w:tcW w:type="dxa" w:w="6960"/>
+            <w:vAlign w:val="center"/>
+          </w:tcPr>
+          <w:p>
+            <w:r>
+              <w:rPr>
+                <w:b w:val="0"/>
+                <w:sz w:val="18"/>
+              </w:rPr>
+              <w:t>Maintain Product Name, Notes, Base Price, and Active/Inactive status; support product list, detail, add, edit, search, sort, and filter behavior.</w:t>
+            </w:r>
+          </w:p>
+        </w:tc>
+      </w:tr>
+      <w:tr>
+        <w:tc>
+          <w:tcPr>
+            <w:tcW w:type="dxa" w:w="2400"/>
+            <w:vAlign w:val="center"/>
+          </w:tcPr>
+          <w:p>
+            <w:r>
+              <w:rPr>
+                <w:b w:val="0"/>
+                <w:sz w:val="18"/>
+              </w:rPr>
+              <w:t>Pre Order / PO management</w:t>
+            </w:r>
+          </w:p>
+        </w:tc>
+        <w:tc>
+          <w:tcPr>
+            <w:tcW w:type="dxa" w:w="6960"/>
+            <w:vAlign w:val="center"/>
+          </w:tcPr>
+          <w:p>
+            <w:r>
+              <w:rPr>
+                <w:b w:val="0"/>
+                <w:sz w:val="18"/>
+              </w:rPr>
+              <w:t>Create and manage Pre Order/PO transactions with uploaded PO document, manual PO/Sales Order ID, required product date, items, status, approval, and transaction chain.</w:t>
+            </w:r>
+          </w:p>
+        </w:tc>
+      </w:tr>
+      <w:tr>
+        <w:tc>
+          <w:tcPr>
+            <w:tcW w:type="dxa" w:w="2400"/>
+            <w:vAlign w:val="center"/>
+          </w:tcPr>
+          <w:p>
+            <w:r>
+              <w:rPr>
+                <w:b w:val="0"/>
+                <w:sz w:val="18"/>
+              </w:rPr>
+              <w:t>Product-based pricing</w:t>
+            </w:r>
+          </w:p>
+        </w:tc>
+        <w:tc>
+          <w:tcPr>
+            <w:tcW w:type="dxa" w:w="6960"/>
+            <w:vAlign w:val="center"/>
+          </w:tcPr>
+          <w:p>
+            <w:r>
+              <w:rPr>
+                <w:b w:val="0"/>
+                <w:sz w:val="18"/>
+              </w:rPr>
+              <w:t>Select Product Name from Product master, auto-fill Base Price, allow Unit Price edits, apply optional Markup/Discount internally, and show customer category tooltip near Unit Price.</w:t>
+            </w:r>
+          </w:p>
+        </w:tc>
+      </w:tr>
+      <w:tr>
+        <w:tc>
+          <w:tcPr>
+            <w:tcW w:type="dxa" w:w="2400"/>
+            <w:vAlign w:val="center"/>
+          </w:tcPr>
+          <w:p>
+            <w:r>
+              <w:rPr>
+                <w:b w:val="0"/>
+                <w:sz w:val="18"/>
+              </w:rPr>
+              <w:t>Notification</w:t>
+            </w:r>
+          </w:p>
+        </w:tc>
+        <w:tc>
+          <w:tcPr>
+            <w:tcW w:type="dxa" w:w="6960"/>
+            <w:vAlign w:val="center"/>
+          </w:tcPr>
+          <w:p>
+            <w:r>
+              <w:rPr>
+                <w:b w:val="0"/>
+                <w:sz w:val="18"/>
+              </w:rPr>
+              <w:t>Remind users to process Pre Order/PO transactions before the required product date.</w:t>
+            </w:r>
+          </w:p>
+        </w:tc>
+      </w:tr>
+      <w:tr>
+        <w:tc>
+          <w:tcPr>
+            <w:tcW w:type="dxa" w:w="2400"/>
+            <w:vAlign w:val="center"/>
+          </w:tcPr>
+          <w:p>
+            <w:r>
+              <w:rPr>
+                <w:b w:val="0"/>
+                <w:sz w:val="18"/>
+              </w:rPr>
+              <w:t>Table usability</w:t>
+            </w:r>
+          </w:p>
+        </w:tc>
+        <w:tc>
+          <w:tcPr>
+            <w:tcW w:type="dxa" w:w="6960"/>
+            <w:vAlign w:val="center"/>
+          </w:tcPr>
+          <w:p>
+            <w:r>
+              <w:rPr>
+                <w:b w:val="0"/>
+                <w:sz w:val="18"/>
+              </w:rPr>
+              <w:t>Ensure displayed sort and filter controls work consistently across every operational table.</w:t>
+            </w:r>
+          </w:p>
+        </w:tc>
+      </w:tr>
     </w:tbl>
     <w:p>
       <w:pPr>
@@ -6588,9 +8320,9 @@
     <w:tbl>
       <w:tblPr>
         <w:tblW w:type="dxa" w:w="9360"/>
-        <w:jc w:val="left"/>
         <w:tblLayout w:type="fixed"/>
         <w:tblLook w:firstColumn="1" w:firstRow="1" w:lastColumn="0" w:lastRow="0" w:noHBand="0" w:noVBand="1" w:val="04A0"/>
+        <w:jc w:val="center"/>
         <w:tblInd w:type="dxa" w:w="120"/>
         <w:tblBorders>
           <w:top w:val="single" w:sz="4" w:space="0" w:color="CBD5E1"/>
@@ -7042,6 +8774,102 @@
           </w:p>
         </w:tc>
       </w:tr>
+      <w:tr>
+        <w:tc>
+          <w:tcPr>
+            <w:tcW w:type="dxa" w:w="2000"/>
+            <w:vAlign w:val="center"/>
+          </w:tcPr>
+          <w:p>
+            <w:r>
+              <w:rPr>
+                <w:b w:val="0"/>
+                <w:sz w:val="18"/>
+              </w:rPr>
+              <w:t>Usability - tables</w:t>
+            </w:r>
+          </w:p>
+        </w:tc>
+        <w:tc>
+          <w:tcPr>
+            <w:tcW w:type="dxa" w:w="7360"/>
+            <w:vAlign w:val="center"/>
+          </w:tcPr>
+          <w:p>
+            <w:r>
+              <w:rPr>
+                <w:b w:val="0"/>
+                <w:sz w:val="18"/>
+              </w:rPr>
+              <w:t>Sort and filter controls should behave consistently and visibly across operational list pages.</w:t>
+            </w:r>
+          </w:p>
+        </w:tc>
+      </w:tr>
+      <w:tr>
+        <w:tc>
+          <w:tcPr>
+            <w:tcW w:type="dxa" w:w="2000"/>
+            <w:vAlign w:val="center"/>
+          </w:tcPr>
+          <w:p>
+            <w:r>
+              <w:rPr>
+                <w:b w:val="0"/>
+                <w:sz w:val="18"/>
+              </w:rPr>
+              <w:t>File handling</w:t>
+            </w:r>
+          </w:p>
+        </w:tc>
+        <w:tc>
+          <w:tcPr>
+            <w:tcW w:type="dxa" w:w="7360"/>
+            <w:vAlign w:val="center"/>
+          </w:tcPr>
+          <w:p>
+            <w:r>
+              <w:rPr>
+                <w:b w:val="0"/>
+                <w:sz w:val="18"/>
+              </w:rPr>
+              <w:t>PO document upload should accept the approved file types and keep the file linked to the correct Pre Order/PO record.</w:t>
+            </w:r>
+          </w:p>
+        </w:tc>
+      </w:tr>
+      <w:tr>
+        <w:tc>
+          <w:tcPr>
+            <w:tcW w:type="dxa" w:w="2000"/>
+            <w:vAlign w:val="center"/>
+          </w:tcPr>
+          <w:p>
+            <w:r>
+              <w:rPr>
+                <w:b w:val="0"/>
+                <w:sz w:val="18"/>
+              </w:rPr>
+              <w:t>Notification reliability</w:t>
+            </w:r>
+          </w:p>
+        </w:tc>
+        <w:tc>
+          <w:tcPr>
+            <w:tcW w:type="dxa" w:w="7360"/>
+            <w:vAlign w:val="center"/>
+          </w:tcPr>
+          <w:p>
+            <w:r>
+              <w:rPr>
+                <w:b w:val="0"/>
+                <w:sz w:val="18"/>
+              </w:rPr>
+              <w:t>PO reminders should be visible before the required product date so users can process the transaction in time.</w:t>
+            </w:r>
+          </w:p>
+        </w:tc>
+      </w:tr>
     </w:tbl>
     <w:p>
       <w:pPr>
@@ -7059,9 +8887,9 @@
     <w:tbl>
       <w:tblPr>
         <w:tblW w:type="dxa" w:w="9360"/>
-        <w:jc w:val="left"/>
         <w:tblLayout w:type="fixed"/>
         <w:tblLook w:firstColumn="1" w:firstRow="1" w:lastColumn="0" w:lastRow="0" w:noHBand="0" w:noVBand="1" w:val="04A0"/>
+        <w:jc w:val="center"/>
         <w:tblInd w:type="dxa" w:w="120"/>
         <w:tblBorders>
           <w:top w:val="single" w:sz="4" w:space="0" w:color="CBD5E1"/>
@@ -8283,6 +10111,523 @@
           </w:p>
         </w:tc>
       </w:tr>
+      <w:tr>
+        <w:tc>
+          <w:tcPr>
+            <w:tcW w:type="dxa" w:w="1100"/>
+            <w:vAlign w:val="center"/>
+          </w:tcPr>
+          <w:p>
+            <w:r>
+              <w:rPr>
+                <w:b w:val="0"/>
+                <w:sz w:val="18"/>
+              </w:rPr>
+              <w:t>RULE-015</w:t>
+            </w:r>
+          </w:p>
+        </w:tc>
+        <w:tc>
+          <w:tcPr>
+            <w:tcW w:type="dxa" w:w="6200"/>
+            <w:vAlign w:val="center"/>
+          </w:tcPr>
+          <w:p>
+            <w:r>
+              <w:rPr>
+                <w:b w:val="0"/>
+                <w:sz w:val="18"/>
+              </w:rPr>
+              <w:t>Product records may be Active or Inactive; inactive products should not be used for new item selection unless explicitly allowed for historical review.</w:t>
+            </w:r>
+          </w:p>
+        </w:tc>
+        <w:tc>
+          <w:tcPr>
+            <w:tcW w:type="dxa" w:w="2060"/>
+            <w:vAlign w:val="center"/>
+          </w:tcPr>
+          <w:p>
+            <w:r>
+              <w:rPr>
+                <w:b w:val="0"/>
+                <w:sz w:val="18"/>
+              </w:rPr>
+              <w:t>Products</w:t>
+            </w:r>
+          </w:p>
+        </w:tc>
+      </w:tr>
+      <w:tr>
+        <w:tc>
+          <w:tcPr>
+            <w:tcW w:type="dxa" w:w="1100"/>
+            <w:vAlign w:val="center"/>
+          </w:tcPr>
+          <w:p>
+            <w:r>
+              <w:rPr>
+                <w:b w:val="0"/>
+                <w:sz w:val="18"/>
+              </w:rPr>
+              <w:t>RULE-016</w:t>
+            </w:r>
+          </w:p>
+        </w:tc>
+        <w:tc>
+          <w:tcPr>
+            <w:tcW w:type="dxa" w:w="6200"/>
+            <w:vAlign w:val="center"/>
+          </w:tcPr>
+          <w:p>
+            <w:r>
+              <w:rPr>
+                <w:b w:val="0"/>
+                <w:sz w:val="18"/>
+              </w:rPr>
+              <w:t>Product Name in Sales Order and Pre Order item entry must be selected from Product master data rather than typed as free text.</w:t>
+            </w:r>
+          </w:p>
+        </w:tc>
+        <w:tc>
+          <w:tcPr>
+            <w:tcW w:type="dxa" w:w="2060"/>
+            <w:vAlign w:val="center"/>
+          </w:tcPr>
+          <w:p>
+            <w:r>
+              <w:rPr>
+                <w:b w:val="0"/>
+                <w:sz w:val="18"/>
+              </w:rPr>
+              <w:t>Sales Orders / Pre Orders / Products</w:t>
+            </w:r>
+          </w:p>
+        </w:tc>
+      </w:tr>
+      <w:tr>
+        <w:tc>
+          <w:tcPr>
+            <w:tcW w:type="dxa" w:w="1100"/>
+            <w:vAlign w:val="center"/>
+          </w:tcPr>
+          <w:p>
+            <w:r>
+              <w:rPr>
+                <w:b w:val="0"/>
+                <w:sz w:val="18"/>
+              </w:rPr>
+              <w:t>RULE-017</w:t>
+            </w:r>
+          </w:p>
+        </w:tc>
+        <w:tc>
+          <w:tcPr>
+            <w:tcW w:type="dxa" w:w="6200"/>
+            <w:vAlign w:val="center"/>
+          </w:tcPr>
+          <w:p>
+            <w:r>
+              <w:rPr>
+                <w:b w:val="0"/>
+                <w:sz w:val="18"/>
+              </w:rPr>
+              <w:t>Selecting a Product automatically fills Unit Price from the product Base Price, but the Unit Price may still be edited before saving.</w:t>
+            </w:r>
+          </w:p>
+        </w:tc>
+        <w:tc>
+          <w:tcPr>
+            <w:tcW w:type="dxa" w:w="2060"/>
+            <w:vAlign w:val="center"/>
+          </w:tcPr>
+          <w:p>
+            <w:r>
+              <w:rPr>
+                <w:b w:val="0"/>
+                <w:sz w:val="18"/>
+              </w:rPr>
+              <w:t>Pricing</w:t>
+            </w:r>
+          </w:p>
+        </w:tc>
+      </w:tr>
+      <w:tr>
+        <w:tc>
+          <w:tcPr>
+            <w:tcW w:type="dxa" w:w="1100"/>
+            <w:vAlign w:val="center"/>
+          </w:tcPr>
+          <w:p>
+            <w:r>
+              <w:rPr>
+                <w:b w:val="0"/>
+                <w:sz w:val="18"/>
+              </w:rPr>
+              <w:t>RULE-018</w:t>
+            </w:r>
+          </w:p>
+        </w:tc>
+        <w:tc>
+          <w:tcPr>
+            <w:tcW w:type="dxa" w:w="6200"/>
+            <w:vAlign w:val="center"/>
+          </w:tcPr>
+          <w:p>
+            <w:r>
+              <w:rPr>
+                <w:b w:val="0"/>
+                <w:sz w:val="18"/>
+              </w:rPr>
+              <w:t>Markup increases Unit Price and Discount reduces Unit Price; both fields are optional and must be recorded internally when used.</w:t>
+            </w:r>
+          </w:p>
+        </w:tc>
+        <w:tc>
+          <w:tcPr>
+            <w:tcW w:type="dxa" w:w="2060"/>
+            <w:vAlign w:val="center"/>
+          </w:tcPr>
+          <w:p>
+            <w:r>
+              <w:rPr>
+                <w:b w:val="0"/>
+                <w:sz w:val="18"/>
+              </w:rPr>
+              <w:t>Pricing</w:t>
+            </w:r>
+          </w:p>
+        </w:tc>
+      </w:tr>
+      <w:tr>
+        <w:tc>
+          <w:tcPr>
+            <w:tcW w:type="dxa" w:w="1100"/>
+            <w:vAlign w:val="center"/>
+          </w:tcPr>
+          <w:p>
+            <w:r>
+              <w:rPr>
+                <w:b w:val="0"/>
+                <w:sz w:val="18"/>
+              </w:rPr>
+              <w:t>RULE-019</w:t>
+            </w:r>
+          </w:p>
+        </w:tc>
+        <w:tc>
+          <w:tcPr>
+            <w:tcW w:type="dxa" w:w="6200"/>
+            <w:vAlign w:val="center"/>
+          </w:tcPr>
+          <w:p>
+            <w:r>
+              <w:rPr>
+                <w:b w:val="0"/>
+                <w:sz w:val="18"/>
+              </w:rPr>
+              <w:t>Markup and Discount values must not appear on printed Invoice or Surat Jalan output.</w:t>
+            </w:r>
+          </w:p>
+        </w:tc>
+        <w:tc>
+          <w:tcPr>
+            <w:tcW w:type="dxa" w:w="2060"/>
+            <w:vAlign w:val="center"/>
+          </w:tcPr>
+          <w:p>
+            <w:r>
+              <w:rPr>
+                <w:b w:val="0"/>
+                <w:sz w:val="18"/>
+              </w:rPr>
+              <w:t>Printed Documents / Pricing</w:t>
+            </w:r>
+          </w:p>
+        </w:tc>
+      </w:tr>
+      <w:tr>
+        <w:tc>
+          <w:tcPr>
+            <w:tcW w:type="dxa" w:w="1100"/>
+            <w:vAlign w:val="center"/>
+          </w:tcPr>
+          <w:p>
+            <w:r>
+              <w:rPr>
+                <w:b w:val="0"/>
+                <w:sz w:val="18"/>
+              </w:rPr>
+              <w:t>RULE-020</w:t>
+            </w:r>
+          </w:p>
+        </w:tc>
+        <w:tc>
+          <w:tcPr>
+            <w:tcW w:type="dxa" w:w="6200"/>
+            <w:vAlign w:val="center"/>
+          </w:tcPr>
+          <w:p>
+            <w:r>
+              <w:rPr>
+                <w:b w:val="0"/>
+                <w:sz w:val="18"/>
+              </w:rPr>
+              <w:t>Markup and Discount changes must be visible in system records and Audit Trail for traceability.</w:t>
+            </w:r>
+          </w:p>
+        </w:tc>
+        <w:tc>
+          <w:tcPr>
+            <w:tcW w:type="dxa" w:w="2060"/>
+            <w:vAlign w:val="center"/>
+          </w:tcPr>
+          <w:p>
+            <w:r>
+              <w:rPr>
+                <w:b w:val="0"/>
+                <w:sz w:val="18"/>
+              </w:rPr>
+              <w:t>Pricing / Audit Trail</w:t>
+            </w:r>
+          </w:p>
+        </w:tc>
+      </w:tr>
+      <w:tr>
+        <w:tc>
+          <w:tcPr>
+            <w:tcW w:type="dxa" w:w="1100"/>
+            <w:vAlign w:val="center"/>
+          </w:tcPr>
+          <w:p>
+            <w:r>
+              <w:rPr>
+                <w:b w:val="0"/>
+                <w:sz w:val="18"/>
+              </w:rPr>
+              <w:t>RULE-021</w:t>
+            </w:r>
+          </w:p>
+        </w:tc>
+        <w:tc>
+          <w:tcPr>
+            <w:tcW w:type="dxa" w:w="6200"/>
+            <w:vAlign w:val="center"/>
+          </w:tcPr>
+          <w:p>
+            <w:r>
+              <w:rPr>
+                <w:b w:val="0"/>
+                <w:sz w:val="18"/>
+              </w:rPr>
+              <w:t>A Pre Order/PO transaction must include manual PO/Sales Order ID, required product date, and uploaded PO document when the business process requires PO evidence.</w:t>
+            </w:r>
+          </w:p>
+        </w:tc>
+        <w:tc>
+          <w:tcPr>
+            <w:tcW w:type="dxa" w:w="2060"/>
+            <w:vAlign w:val="center"/>
+          </w:tcPr>
+          <w:p>
+            <w:r>
+              <w:rPr>
+                <w:b w:val="0"/>
+                <w:sz w:val="18"/>
+              </w:rPr>
+              <w:t>Pre Orders</w:t>
+            </w:r>
+          </w:p>
+        </w:tc>
+      </w:tr>
+      <w:tr>
+        <w:tc>
+          <w:tcPr>
+            <w:tcW w:type="dxa" w:w="1100"/>
+            <w:vAlign w:val="center"/>
+          </w:tcPr>
+          <w:p>
+            <w:r>
+              <w:rPr>
+                <w:b w:val="0"/>
+                <w:sz w:val="18"/>
+              </w:rPr>
+              <w:t>RULE-022</w:t>
+            </w:r>
+          </w:p>
+        </w:tc>
+        <w:tc>
+          <w:tcPr>
+            <w:tcW w:type="dxa" w:w="6200"/>
+            <w:vAlign w:val="center"/>
+          </w:tcPr>
+          <w:p>
+            <w:r>
+              <w:rPr>
+                <w:b w:val="0"/>
+                <w:sz w:val="18"/>
+              </w:rPr>
+              <w:t>Pre Order/PO transactions are listed separately from normal Sales Orders but follow the same eligible invoice, payment, receivable, billing, and Surat Jalan process after validation.</w:t>
+            </w:r>
+          </w:p>
+        </w:tc>
+        <w:tc>
+          <w:tcPr>
+            <w:tcW w:type="dxa" w:w="2060"/>
+            <w:vAlign w:val="center"/>
+          </w:tcPr>
+          <w:p>
+            <w:r>
+              <w:rPr>
+                <w:b w:val="0"/>
+                <w:sz w:val="18"/>
+              </w:rPr>
+              <w:t>Pre Orders / Revenue Cycle</w:t>
+            </w:r>
+          </w:p>
+        </w:tc>
+      </w:tr>
+      <w:tr>
+        <w:tc>
+          <w:tcPr>
+            <w:tcW w:type="dxa" w:w="1100"/>
+            <w:vAlign w:val="center"/>
+          </w:tcPr>
+          <w:p>
+            <w:r>
+              <w:rPr>
+                <w:b w:val="0"/>
+                <w:sz w:val="18"/>
+              </w:rPr>
+              <w:t>RULE-023</w:t>
+            </w:r>
+          </w:p>
+        </w:tc>
+        <w:tc>
+          <w:tcPr>
+            <w:tcW w:type="dxa" w:w="6200"/>
+            <w:vAlign w:val="center"/>
+          </w:tcPr>
+          <w:p>
+            <w:r>
+              <w:rPr>
+                <w:b w:val="0"/>
+                <w:sz w:val="18"/>
+              </w:rPr>
+              <w:t>PO reminder notifications should be generated before the required product date based on the recorded date needed field.</w:t>
+            </w:r>
+          </w:p>
+        </w:tc>
+        <w:tc>
+          <w:tcPr>
+            <w:tcW w:type="dxa" w:w="2060"/>
+            <w:vAlign w:val="center"/>
+          </w:tcPr>
+          <w:p>
+            <w:r>
+              <w:rPr>
+                <w:b w:val="0"/>
+                <w:sz w:val="18"/>
+              </w:rPr>
+              <w:t>Notifications / Pre Orders</w:t>
+            </w:r>
+          </w:p>
+        </w:tc>
+      </w:tr>
+      <w:tr>
+        <w:tc>
+          <w:tcPr>
+            <w:tcW w:type="dxa" w:w="1100"/>
+            <w:vAlign w:val="center"/>
+          </w:tcPr>
+          <w:p>
+            <w:r>
+              <w:rPr>
+                <w:b w:val="0"/>
+                <w:sz w:val="18"/>
+              </w:rPr>
+              <w:t>RULE-024</w:t>
+            </w:r>
+          </w:p>
+        </w:tc>
+        <w:tc>
+          <w:tcPr>
+            <w:tcW w:type="dxa" w:w="6200"/>
+            <w:vAlign w:val="center"/>
+          </w:tcPr>
+          <w:p>
+            <w:r>
+              <w:rPr>
+                <w:b w:val="0"/>
+                <w:sz w:val="18"/>
+              </w:rPr>
+              <w:t>Invoice and Surat Jalan printouts must show transaction type and relevant PO details when the source transaction is a Pre Order/PO.</w:t>
+            </w:r>
+          </w:p>
+        </w:tc>
+        <w:tc>
+          <w:tcPr>
+            <w:tcW w:type="dxa" w:w="2060"/>
+            <w:vAlign w:val="center"/>
+          </w:tcPr>
+          <w:p>
+            <w:r>
+              <w:rPr>
+                <w:b w:val="0"/>
+                <w:sz w:val="18"/>
+              </w:rPr>
+              <w:t>Invoices / Surat Jalan</w:t>
+            </w:r>
+          </w:p>
+        </w:tc>
+      </w:tr>
+      <w:tr>
+        <w:tc>
+          <w:tcPr>
+            <w:tcW w:type="dxa" w:w="1100"/>
+            <w:vAlign w:val="center"/>
+          </w:tcPr>
+          <w:p>
+            <w:r>
+              <w:rPr>
+                <w:b w:val="0"/>
+                <w:sz w:val="18"/>
+              </w:rPr>
+              <w:t>RULE-025</w:t>
+            </w:r>
+          </w:p>
+        </w:tc>
+        <w:tc>
+          <w:tcPr>
+            <w:tcW w:type="dxa" w:w="6200"/>
+            <w:vAlign w:val="center"/>
+          </w:tcPr>
+          <w:p>
+            <w:r>
+              <w:rPr>
+                <w:b w:val="0"/>
+                <w:sz w:val="18"/>
+              </w:rPr>
+              <w:t>Displayed sort and filter controls on tables must apply to the table data shown to the user.</w:t>
+            </w:r>
+          </w:p>
+        </w:tc>
+        <w:tc>
+          <w:tcPr>
+            <w:tcW w:type="dxa" w:w="2060"/>
+            <w:vAlign w:val="center"/>
+          </w:tcPr>
+          <w:p>
+            <w:r>
+              <w:rPr>
+                <w:b w:val="0"/>
+                <w:sz w:val="18"/>
+              </w:rPr>
+              <w:t>Tables / UX</w:t>
+            </w:r>
+          </w:p>
+        </w:tc>
+      </w:tr>
     </w:tbl>
     <w:p>
       <w:pPr>
@@ -8300,9 +10645,9 @@
     <w:tbl>
       <w:tblPr>
         <w:tblW w:type="dxa" w:w="9360"/>
-        <w:jc w:val="left"/>
         <w:tblLayout w:type="fixed"/>
         <w:tblLook w:firstColumn="1" w:firstRow="1" w:lastColumn="0" w:lastRow="0" w:noHBand="0" w:noVBand="1" w:val="04A0"/>
+        <w:jc w:val="center"/>
         <w:tblInd w:type="dxa" w:w="120"/>
         <w:tblBorders>
           <w:top w:val="single" w:sz="4" w:space="0" w:color="CBD5E1"/>
@@ -8469,17 +10814,12 @@
             </w:tcMar>
           </w:tcPr>
           <w:p>
-            <w:pPr>
-              <w:spacing w:before="0" w:after="60" w:line="264" w:lineRule="auto"/>
-            </w:pPr>
-            <w:r>
-              <w:rPr>
-                <w:rFonts w:ascii="Calibri" w:hAnsi="Calibri"/>
-                <w:b w:val="0"/>
-                <w:color w:val="1F2937"/>
-                <w:sz w:val="17"/>
-              </w:rPr>
-              <w:t>Order number, customer, order date, status, subtotal, total, payment term, approval status/risk, notes, creator, and timestamps.</w:t>
+            <w:r>
+              <w:rPr>
+                <w:b w:val="0"/>
+                <w:sz w:val="18"/>
+              </w:rPr>
+              <w:t>Order number, transaction type, customer, order date, status, subtotal, total, payment term, approval status/risk, notes, creator, and timestamps. For Pre Order/PO, also include manual PO/Sales Order ID, uploaded PO document reference, and required product date.</w:t>
             </w:r>
           </w:p>
         </w:tc>
@@ -8497,17 +10837,12 @@
             </w:tcMar>
           </w:tcPr>
           <w:p>
-            <w:pPr>
-              <w:spacing w:before="0" w:after="60" w:line="264" w:lineRule="auto"/>
-            </w:pPr>
-            <w:r>
-              <w:rPr>
-                <w:rFonts w:ascii="Calibri" w:hAnsi="Calibri"/>
-                <w:b w:val="0"/>
-                <w:color w:val="1F2937"/>
-                <w:sz w:val="17"/>
-              </w:rPr>
-              <w:t>SalesOrderItem</w:t>
+            <w:r>
+              <w:rPr>
+                <w:b w:val="0"/>
+                <w:sz w:val="18"/>
+              </w:rPr>
+              <w:t>SalesOrderItem / PreOrderItem</w:t>
             </w:r>
           </w:p>
         </w:tc>
@@ -8523,17 +10858,12 @@
             </w:tcMar>
           </w:tcPr>
           <w:p>
-            <w:pPr>
-              <w:spacing w:before="0" w:after="60" w:line="264" w:lineRule="auto"/>
-            </w:pPr>
-            <w:r>
-              <w:rPr>
-                <w:rFonts w:ascii="Calibri" w:hAnsi="Calibri"/>
-                <w:b w:val="0"/>
-                <w:color w:val="1F2937"/>
-                <w:sz w:val="17"/>
-              </w:rPr>
-              <w:t>Item name, quantity, unit price, and subtotal.</w:t>
+            <w:r>
+              <w:rPr>
+                <w:b w:val="0"/>
+                <w:sz w:val="18"/>
+              </w:rPr>
+              <w:t>Product reference, Product Name, quantity, base price, editable unit price, optional markup, optional discount, subtotal, and internal pricing adjustment notes where applicable.</w:t>
             </w:r>
           </w:p>
         </w:tc>
@@ -8966,6 +11296,166 @@
                 <w:sz w:val="17"/>
               </w:rPr>
               <w:t>Actor, role, module, entity, transaction code, action, confirmation note, change summary, old/new values, and timestamp.</w:t>
+            </w:r>
+          </w:p>
+        </w:tc>
+      </w:tr>
+      <w:tr>
+        <w:tc>
+          <w:tcPr>
+            <w:tcW w:type="dxa" w:w="2300"/>
+            <w:vAlign w:val="center"/>
+          </w:tcPr>
+          <w:p>
+            <w:r>
+              <w:rPr>
+                <w:b w:val="0"/>
+                <w:sz w:val="18"/>
+              </w:rPr>
+              <w:t>Product</w:t>
+            </w:r>
+          </w:p>
+        </w:tc>
+        <w:tc>
+          <w:tcPr>
+            <w:tcW w:type="dxa" w:w="7060"/>
+            <w:vAlign w:val="center"/>
+          </w:tcPr>
+          <w:p>
+            <w:r>
+              <w:rPr>
+                <w:b w:val="0"/>
+                <w:sz w:val="18"/>
+              </w:rPr>
+              <w:t>Product Name, Notes, Base Price, Active/Inactive status, creator/updater, and timestamps.</w:t>
+            </w:r>
+          </w:p>
+        </w:tc>
+      </w:tr>
+      <w:tr>
+        <w:tc>
+          <w:tcPr>
+            <w:tcW w:type="dxa" w:w="2300"/>
+            <w:vAlign w:val="center"/>
+          </w:tcPr>
+          <w:p>
+            <w:r>
+              <w:rPr>
+                <w:b w:val="0"/>
+                <w:sz w:val="18"/>
+              </w:rPr>
+              <w:t>PreOrder / POTransaction</w:t>
+            </w:r>
+          </w:p>
+        </w:tc>
+        <w:tc>
+          <w:tcPr>
+            <w:tcW w:type="dxa" w:w="7060"/>
+            <w:vAlign w:val="center"/>
+          </w:tcPr>
+          <w:p>
+            <w:r>
+              <w:rPr>
+                <w:b w:val="0"/>
+                <w:sz w:val="18"/>
+              </w:rPr>
+              <w:t>Separated transaction view for PO-based orders containing customer, manual PO/Sales Order ID, required product date, uploaded PO document, transaction type, status, items, totals, approval, invoice/payment/delivery links, notes, and timestamps.</w:t>
+            </w:r>
+          </w:p>
+        </w:tc>
+      </w:tr>
+      <w:tr>
+        <w:tc>
+          <w:tcPr>
+            <w:tcW w:type="dxa" w:w="2300"/>
+            <w:vAlign w:val="center"/>
+          </w:tcPr>
+          <w:p>
+            <w:r>
+              <w:rPr>
+                <w:b w:val="0"/>
+                <w:sz w:val="18"/>
+              </w:rPr>
+              <w:t>PODocumentAttachment</w:t>
+            </w:r>
+          </w:p>
+        </w:tc>
+        <w:tc>
+          <w:tcPr>
+            <w:tcW w:type="dxa" w:w="7060"/>
+            <w:vAlign w:val="center"/>
+          </w:tcPr>
+          <w:p>
+            <w:r>
+              <w:rPr>
+                <w:b w:val="0"/>
+                <w:sz w:val="18"/>
+              </w:rPr>
+              <w:t>Uploaded file name, file type, storage path/reference, linked Pre Order/PO transaction, uploader, and upload timestamp.</w:t>
+            </w:r>
+          </w:p>
+        </w:tc>
+      </w:tr>
+      <w:tr>
+        <w:tc>
+          <w:tcPr>
+            <w:tcW w:type="dxa" w:w="2300"/>
+            <w:vAlign w:val="center"/>
+          </w:tcPr>
+          <w:p>
+            <w:r>
+              <w:rPr>
+                <w:b w:val="0"/>
+                <w:sz w:val="18"/>
+              </w:rPr>
+              <w:t>Notification</w:t>
+            </w:r>
+          </w:p>
+        </w:tc>
+        <w:tc>
+          <w:tcPr>
+            <w:tcW w:type="dxa" w:w="7060"/>
+            <w:vAlign w:val="center"/>
+          </w:tcPr>
+          <w:p>
+            <w:r>
+              <w:rPr>
+                <w:b w:val="0"/>
+                <w:sz w:val="18"/>
+              </w:rPr>
+              <w:t>Related transaction, reminder type, due/required date, message, status/read condition, and timestamp.</w:t>
+            </w:r>
+          </w:p>
+        </w:tc>
+      </w:tr>
+      <w:tr>
+        <w:tc>
+          <w:tcPr>
+            <w:tcW w:type="dxa" w:w="2300"/>
+            <w:vAlign w:val="center"/>
+          </w:tcPr>
+          <w:p>
+            <w:r>
+              <w:rPr>
+                <w:b w:val="0"/>
+                <w:sz w:val="18"/>
+              </w:rPr>
+              <w:t>PricingAdjustment</w:t>
+            </w:r>
+          </w:p>
+        </w:tc>
+        <w:tc>
+          <w:tcPr>
+            <w:tcW w:type="dxa" w:w="7060"/>
+            <w:vAlign w:val="center"/>
+          </w:tcPr>
+          <w:p>
+            <w:r>
+              <w:rPr>
+                <w:b w:val="0"/>
+                <w:sz w:val="18"/>
+              </w:rPr>
+              <w:t>Internal markup and discount values, calculation effect, related item, actor, and timestamp; excluded from customer-facing printed output.</w:t>
             </w:r>
           </w:p>
         </w:tc>
@@ -8987,9 +11477,9 @@
     <w:tbl>
       <w:tblPr>
         <w:tblW w:type="dxa" w:w="9360"/>
-        <w:jc w:val="left"/>
         <w:tblLayout w:type="fixed"/>
         <w:tblLook w:firstColumn="1" w:firstRow="1" w:lastColumn="0" w:lastRow="0" w:noHBand="0" w:noVBand="1" w:val="04A0"/>
+        <w:jc w:val="center"/>
         <w:tblInd w:type="dxa" w:w="120"/>
         <w:tblBorders>
           <w:top w:val="single" w:sz="4" w:space="0" w:color="CBD5E1"/>
@@ -9495,6 +11985,134 @@
           </w:p>
         </w:tc>
       </w:tr>
+      <w:tr>
+        <w:tc>
+          <w:tcPr>
+            <w:tcW w:type="dxa" w:w="1700"/>
+            <w:vAlign w:val="center"/>
+          </w:tcPr>
+          <w:p>
+            <w:r>
+              <w:rPr>
+                <w:b w:val="0"/>
+                <w:sz w:val="18"/>
+              </w:rPr>
+              <w:t>Assumption</w:t>
+            </w:r>
+          </w:p>
+        </w:tc>
+        <w:tc>
+          <w:tcPr>
+            <w:tcW w:type="dxa" w:w="7660"/>
+            <w:vAlign w:val="center"/>
+          </w:tcPr>
+          <w:p>
+            <w:r>
+              <w:rPr>
+                <w:b w:val="0"/>
+                <w:sz w:val="18"/>
+              </w:rPr>
+              <w:t>Product base price is used as a default transaction price and may be adjusted by authorized users according to business context.</w:t>
+            </w:r>
+          </w:p>
+        </w:tc>
+      </w:tr>
+      <w:tr>
+        <w:tc>
+          <w:tcPr>
+            <w:tcW w:type="dxa" w:w="1700"/>
+            <w:vAlign w:val="center"/>
+          </w:tcPr>
+          <w:p>
+            <w:r>
+              <w:rPr>
+                <w:b w:val="0"/>
+                <w:sz w:val="18"/>
+              </w:rPr>
+              <w:t>Assumption</w:t>
+            </w:r>
+          </w:p>
+        </w:tc>
+        <w:tc>
+          <w:tcPr>
+            <w:tcW w:type="dxa" w:w="7660"/>
+            <w:vAlign w:val="center"/>
+          </w:tcPr>
+          <w:p>
+            <w:r>
+              <w:rPr>
+                <w:b w:val="0"/>
+                <w:sz w:val="18"/>
+              </w:rPr>
+              <w:t>PO document upload stores supporting evidence only; the user remains responsible for entering PO/Sales Order ID and required product date accurately.</w:t>
+            </w:r>
+          </w:p>
+        </w:tc>
+      </w:tr>
+      <w:tr>
+        <w:tc>
+          <w:tcPr>
+            <w:tcW w:type="dxa" w:w="1700"/>
+            <w:vAlign w:val="center"/>
+          </w:tcPr>
+          <w:p>
+            <w:r>
+              <w:rPr>
+                <w:b w:val="0"/>
+                <w:sz w:val="18"/>
+              </w:rPr>
+              <w:t>Constraint</w:t>
+            </w:r>
+          </w:p>
+        </w:tc>
+        <w:tc>
+          <w:tcPr>
+            <w:tcW w:type="dxa" w:w="7660"/>
+            <w:vAlign w:val="center"/>
+          </w:tcPr>
+          <w:p>
+            <w:r>
+              <w:rPr>
+                <w:b w:val="0"/>
+                <w:sz w:val="18"/>
+              </w:rPr>
+              <w:t>Markup and Discount are internal operational fields and should not be exposed in customer-facing Invoice or Surat Jalan output.</w:t>
+            </w:r>
+          </w:p>
+        </w:tc>
+      </w:tr>
+      <w:tr>
+        <w:tc>
+          <w:tcPr>
+            <w:tcW w:type="dxa" w:w="1700"/>
+            <w:vAlign w:val="center"/>
+          </w:tcPr>
+          <w:p>
+            <w:r>
+              <w:rPr>
+                <w:b w:val="0"/>
+                <w:sz w:val="18"/>
+              </w:rPr>
+              <w:t>Constraint</w:t>
+            </w:r>
+          </w:p>
+        </w:tc>
+        <w:tc>
+          <w:tcPr>
+            <w:tcW w:type="dxa" w:w="7660"/>
+            <w:vAlign w:val="center"/>
+          </w:tcPr>
+          <w:p>
+            <w:r>
+              <w:rPr>
+                <w:b w:val="0"/>
+                <w:sz w:val="18"/>
+              </w:rPr>
+              <w:t>PO reminders depend on the required product date being entered correctly.</w:t>
+            </w:r>
+          </w:p>
+        </w:tc>
+      </w:tr>
     </w:tbl>
     <w:p>
       <w:pPr>
@@ -9512,9 +12130,9 @@
     <w:tbl>
       <w:tblPr>
         <w:tblW w:type="dxa" w:w="9360"/>
-        <w:jc w:val="left"/>
         <w:tblLayout w:type="fixed"/>
         <w:tblLook w:firstColumn="1" w:firstRow="1" w:lastColumn="0" w:lastRow="0" w:noHBand="0" w:noVBand="1" w:val="04A0"/>
+        <w:jc w:val="center"/>
         <w:tblInd w:type="dxa" w:w="120"/>
         <w:tblBorders>
           <w:top w:val="single" w:sz="4" w:space="0" w:color="CBD5E1"/>
@@ -10496,6 +13114,382 @@
           </w:p>
         </w:tc>
       </w:tr>
+      <w:tr>
+        <w:tc>
+          <w:tcPr>
+            <w:tcW w:type="dxa" w:w="900"/>
+            <w:vAlign w:val="center"/>
+          </w:tcPr>
+          <w:p>
+            <w:r>
+              <w:rPr>
+                <w:b w:val="0"/>
+                <w:sz w:val="18"/>
+              </w:rPr>
+              <w:t>AC-012</w:t>
+            </w:r>
+          </w:p>
+        </w:tc>
+        <w:tc>
+          <w:tcPr>
+            <w:tcW w:type="dxa" w:w="4300"/>
+            <w:vAlign w:val="center"/>
+          </w:tcPr>
+          <w:p>
+            <w:r>
+              <w:rPr>
+                <w:b w:val="0"/>
+                <w:sz w:val="18"/>
+              </w:rPr>
+              <w:t>Authorized users can create, view, edit, and deactivate Product records.</w:t>
+            </w:r>
+          </w:p>
+        </w:tc>
+        <w:tc>
+          <w:tcPr>
+            <w:tcW w:type="dxa" w:w="4160"/>
+            <w:vAlign w:val="center"/>
+          </w:tcPr>
+          <w:p>
+            <w:r>
+              <w:rPr>
+                <w:b w:val="0"/>
+                <w:sz w:val="18"/>
+              </w:rPr>
+              <w:t>Product appears in the Product list, can be opened in detail view, can be edited, and inactive status is reflected correctly.</w:t>
+            </w:r>
+          </w:p>
+        </w:tc>
+      </w:tr>
+      <w:tr>
+        <w:tc>
+          <w:tcPr>
+            <w:tcW w:type="dxa" w:w="900"/>
+            <w:vAlign w:val="center"/>
+          </w:tcPr>
+          <w:p>
+            <w:r>
+              <w:rPr>
+                <w:b w:val="0"/>
+                <w:sz w:val="18"/>
+              </w:rPr>
+              <w:t>AC-013</w:t>
+            </w:r>
+          </w:p>
+        </w:tc>
+        <w:tc>
+          <w:tcPr>
+            <w:tcW w:type="dxa" w:w="4300"/>
+            <w:vAlign w:val="center"/>
+          </w:tcPr>
+          <w:p>
+            <w:r>
+              <w:rPr>
+                <w:b w:val="0"/>
+                <w:sz w:val="18"/>
+              </w:rPr>
+              <w:t>Users are prompted to choose normal Sales Order or Pre Order/PO when creating a new transaction.</w:t>
+            </w:r>
+          </w:p>
+        </w:tc>
+        <w:tc>
+          <w:tcPr>
+            <w:tcW w:type="dxa" w:w="4160"/>
+            <w:vAlign w:val="center"/>
+          </w:tcPr>
+          <w:p>
+            <w:r>
+              <w:rPr>
+                <w:b w:val="0"/>
+                <w:sz w:val="18"/>
+              </w:rPr>
+              <w:t>The selected transaction type determines the next form and required fields.</w:t>
+            </w:r>
+          </w:p>
+        </w:tc>
+      </w:tr>
+      <w:tr>
+        <w:tc>
+          <w:tcPr>
+            <w:tcW w:type="dxa" w:w="900"/>
+            <w:vAlign w:val="center"/>
+          </w:tcPr>
+          <w:p>
+            <w:r>
+              <w:rPr>
+                <w:b w:val="0"/>
+                <w:sz w:val="18"/>
+              </w:rPr>
+              <w:t>AC-014</w:t>
+            </w:r>
+          </w:p>
+        </w:tc>
+        <w:tc>
+          <w:tcPr>
+            <w:tcW w:type="dxa" w:w="4300"/>
+            <w:vAlign w:val="center"/>
+          </w:tcPr>
+          <w:p>
+            <w:r>
+              <w:rPr>
+                <w:b w:val="0"/>
+                <w:sz w:val="18"/>
+              </w:rPr>
+              <w:t>Users can create a Pre Order/PO with uploaded PO document, manual PO/Sales Order ID, required product date, customer, products, and payment-term data.</w:t>
+            </w:r>
+          </w:p>
+        </w:tc>
+        <w:tc>
+          <w:tcPr>
+            <w:tcW w:type="dxa" w:w="4160"/>
+            <w:vAlign w:val="center"/>
+          </w:tcPr>
+          <w:p>
+            <w:r>
+              <w:rPr>
+                <w:b w:val="0"/>
+                <w:sz w:val="18"/>
+              </w:rPr>
+              <w:t>Pre Order/PO appears in the separated PO menu and detail page with transaction type shown.</w:t>
+            </w:r>
+          </w:p>
+        </w:tc>
+      </w:tr>
+      <w:tr>
+        <w:tc>
+          <w:tcPr>
+            <w:tcW w:type="dxa" w:w="900"/>
+            <w:vAlign w:val="center"/>
+          </w:tcPr>
+          <w:p>
+            <w:r>
+              <w:rPr>
+                <w:b w:val="0"/>
+                <w:sz w:val="18"/>
+              </w:rPr>
+              <w:t>AC-015</w:t>
+            </w:r>
+          </w:p>
+        </w:tc>
+        <w:tc>
+          <w:tcPr>
+            <w:tcW w:type="dxa" w:w="4300"/>
+            <w:vAlign w:val="center"/>
+          </w:tcPr>
+          <w:p>
+            <w:r>
+              <w:rPr>
+                <w:b w:val="0"/>
+                <w:sz w:val="18"/>
+              </w:rPr>
+              <w:t>Sales Order and Pre Order item entry uses Product Name dropdown from Product master data.</w:t>
+            </w:r>
+          </w:p>
+        </w:tc>
+        <w:tc>
+          <w:tcPr>
+            <w:tcW w:type="dxa" w:w="4160"/>
+            <w:vAlign w:val="center"/>
+          </w:tcPr>
+          <w:p>
+            <w:r>
+              <w:rPr>
+                <w:b w:val="0"/>
+                <w:sz w:val="18"/>
+              </w:rPr>
+              <w:t>Selected Product fills item name and Base Price automatically.</w:t>
+            </w:r>
+          </w:p>
+        </w:tc>
+      </w:tr>
+      <w:tr>
+        <w:tc>
+          <w:tcPr>
+            <w:tcW w:type="dxa" w:w="900"/>
+            <w:vAlign w:val="center"/>
+          </w:tcPr>
+          <w:p>
+            <w:r>
+              <w:rPr>
+                <w:b w:val="0"/>
+                <w:sz w:val="18"/>
+              </w:rPr>
+              <w:t>AC-016</w:t>
+            </w:r>
+          </w:p>
+        </w:tc>
+        <w:tc>
+          <w:tcPr>
+            <w:tcW w:type="dxa" w:w="4300"/>
+            <w:vAlign w:val="center"/>
+          </w:tcPr>
+          <w:p>
+            <w:r>
+              <w:rPr>
+                <w:b w:val="0"/>
+                <w:sz w:val="18"/>
+              </w:rPr>
+              <w:t>Unit Price can be edited after Base Price is auto-filled, and optional Markup/Discount changes the calculated Unit Price.</w:t>
+            </w:r>
+          </w:p>
+        </w:tc>
+        <w:tc>
+          <w:tcPr>
+            <w:tcW w:type="dxa" w:w="4160"/>
+            <w:vAlign w:val="center"/>
+          </w:tcPr>
+          <w:p>
+            <w:r>
+              <w:rPr>
+                <w:b w:val="0"/>
+                <w:sz w:val="18"/>
+              </w:rPr>
+              <w:t>Transaction totals update correctly and pricing adjustment evidence appears only in system/audit records.</w:t>
+            </w:r>
+          </w:p>
+        </w:tc>
+      </w:tr>
+      <w:tr>
+        <w:tc>
+          <w:tcPr>
+            <w:tcW w:type="dxa" w:w="900"/>
+            <w:vAlign w:val="center"/>
+          </w:tcPr>
+          <w:p>
+            <w:r>
+              <w:rPr>
+                <w:b w:val="0"/>
+                <w:sz w:val="18"/>
+              </w:rPr>
+              <w:t>AC-017</w:t>
+            </w:r>
+          </w:p>
+        </w:tc>
+        <w:tc>
+          <w:tcPr>
+            <w:tcW w:type="dxa" w:w="4300"/>
+            <w:vAlign w:val="center"/>
+          </w:tcPr>
+          <w:p>
+            <w:r>
+              <w:rPr>
+                <w:b w:val="0"/>
+                <w:sz w:val="18"/>
+              </w:rPr>
+              <w:t>Invoice and Surat Jalan printouts show transaction type and relevant PO details but do not show Markup or Discount fields.</w:t>
+            </w:r>
+          </w:p>
+        </w:tc>
+        <w:tc>
+          <w:tcPr>
+            <w:tcW w:type="dxa" w:w="4160"/>
+            <w:vAlign w:val="center"/>
+          </w:tcPr>
+          <w:p>
+            <w:r>
+              <w:rPr>
+                <w:b w:val="0"/>
+                <w:sz w:val="18"/>
+              </w:rPr>
+              <w:t>Generated print output includes Sales Order/Pre Order identity and PO details when applicable, with no internal pricing adjustment fields displayed.</w:t>
+            </w:r>
+          </w:p>
+        </w:tc>
+      </w:tr>
+      <w:tr>
+        <w:tc>
+          <w:tcPr>
+            <w:tcW w:type="dxa" w:w="900"/>
+            <w:vAlign w:val="center"/>
+          </w:tcPr>
+          <w:p>
+            <w:r>
+              <w:rPr>
+                <w:b w:val="0"/>
+                <w:sz w:val="18"/>
+              </w:rPr>
+              <w:t>AC-018</w:t>
+            </w:r>
+          </w:p>
+        </w:tc>
+        <w:tc>
+          <w:tcPr>
+            <w:tcW w:type="dxa" w:w="4300"/>
+            <w:vAlign w:val="center"/>
+          </w:tcPr>
+          <w:p>
+            <w:r>
+              <w:rPr>
+                <w:b w:val="0"/>
+                <w:sz w:val="18"/>
+              </w:rPr>
+              <w:t>Pre Order/PO reminder notification appears before the required product date.</w:t>
+            </w:r>
+          </w:p>
+        </w:tc>
+        <w:tc>
+          <w:tcPr>
+            <w:tcW w:type="dxa" w:w="4160"/>
+            <w:vAlign w:val="center"/>
+          </w:tcPr>
+          <w:p>
+            <w:r>
+              <w:rPr>
+                <w:b w:val="0"/>
+                <w:sz w:val="18"/>
+              </w:rPr>
+              <w:t>Notification/reminder area shows the PO transaction that needs processing.</w:t>
+            </w:r>
+          </w:p>
+        </w:tc>
+      </w:tr>
+      <w:tr>
+        <w:tc>
+          <w:tcPr>
+            <w:tcW w:type="dxa" w:w="900"/>
+            <w:vAlign w:val="center"/>
+          </w:tcPr>
+          <w:p>
+            <w:r>
+              <w:rPr>
+                <w:b w:val="0"/>
+                <w:sz w:val="18"/>
+              </w:rPr>
+              <w:t>AC-019</w:t>
+            </w:r>
+          </w:p>
+        </w:tc>
+        <w:tc>
+          <w:tcPr>
+            <w:tcW w:type="dxa" w:w="4300"/>
+            <w:vAlign w:val="center"/>
+          </w:tcPr>
+          <w:p>
+            <w:r>
+              <w:rPr>
+                <w:b w:val="0"/>
+                <w:sz w:val="18"/>
+              </w:rPr>
+              <w:t>Sort and filter controls work on all tables where displayed.</w:t>
+            </w:r>
+          </w:p>
+        </w:tc>
+        <w:tc>
+          <w:tcPr>
+            <w:tcW w:type="dxa" w:w="4160"/>
+            <w:vAlign w:val="center"/>
+          </w:tcPr>
+          <w:p>
+            <w:r>
+              <w:rPr>
+                <w:b w:val="0"/>
+                <w:sz w:val="18"/>
+              </w:rPr>
+              <w:t>User can sort/filter visible list data and the table result changes accordingly.</w:t>
+            </w:r>
+          </w:p>
+        </w:tc>
+      </w:tr>
     </w:tbl>
     <w:p>
       <w:pPr>
@@ -10513,9 +13507,9 @@
     <w:tbl>
       <w:tblPr>
         <w:tblW w:type="dxa" w:w="9360"/>
-        <w:jc w:val="left"/>
         <w:tblLayout w:type="fixed"/>
         <w:tblLook w:firstColumn="1" w:firstRow="1" w:lastColumn="0" w:lastRow="0" w:noHBand="0" w:noVBand="1" w:val="04A0"/>
+        <w:jc w:val="center"/>
         <w:tblInd w:type="dxa" w:w="120"/>
         <w:tblBorders>
           <w:top w:val="single" w:sz="4" w:space="0" w:color="CBD5E1"/>
@@ -10963,6 +13957,166 @@
                 <w:sz w:val="18"/>
               </w:rPr>
               <w:t>Recognize that usability testing and MVP validation do not equal full production system testing.</w:t>
+            </w:r>
+          </w:p>
+        </w:tc>
+      </w:tr>
+      <w:tr>
+        <w:tc>
+          <w:tcPr>
+            <w:tcW w:type="dxa" w:w="2800"/>
+            <w:vAlign w:val="center"/>
+          </w:tcPr>
+          <w:p>
+            <w:r>
+              <w:rPr>
+                <w:b w:val="0"/>
+                <w:sz w:val="18"/>
+              </w:rPr>
+              <w:t>Incorrect product base price</w:t>
+            </w:r>
+          </w:p>
+        </w:tc>
+        <w:tc>
+          <w:tcPr>
+            <w:tcW w:type="dxa" w:w="6560"/>
+            <w:vAlign w:val="center"/>
+          </w:tcPr>
+          <w:p>
+            <w:r>
+              <w:rPr>
+                <w:b w:val="0"/>
+                <w:sz w:val="18"/>
+              </w:rPr>
+              <w:t>Review and maintain Product master data carefully because it becomes the default price source for Sales Order and Pre Order item entry.</w:t>
+            </w:r>
+          </w:p>
+        </w:tc>
+      </w:tr>
+      <w:tr>
+        <w:tc>
+          <w:tcPr>
+            <w:tcW w:type="dxa" w:w="2800"/>
+            <w:vAlign w:val="center"/>
+          </w:tcPr>
+          <w:p>
+            <w:r>
+              <w:rPr>
+                <w:b w:val="0"/>
+                <w:sz w:val="18"/>
+              </w:rPr>
+              <w:t>PO document upload quality</w:t>
+            </w:r>
+          </w:p>
+        </w:tc>
+        <w:tc>
+          <w:tcPr>
+            <w:tcW w:type="dxa" w:w="6560"/>
+            <w:vAlign w:val="center"/>
+          </w:tcPr>
+          <w:p>
+            <w:r>
+              <w:rPr>
+                <w:b w:val="0"/>
+                <w:sz w:val="18"/>
+              </w:rPr>
+              <w:t>Define acceptable file formats and naming conventions; uploaded documents should remain linked to the correct Pre Order/PO transaction.</w:t>
+            </w:r>
+          </w:p>
+        </w:tc>
+      </w:tr>
+      <w:tr>
+        <w:tc>
+          <w:tcPr>
+            <w:tcW w:type="dxa" w:w="2800"/>
+            <w:vAlign w:val="center"/>
+          </w:tcPr>
+          <w:p>
+            <w:r>
+              <w:rPr>
+                <w:b w:val="0"/>
+                <w:sz w:val="18"/>
+              </w:rPr>
+              <w:t>Missed PO required date</w:t>
+            </w:r>
+          </w:p>
+        </w:tc>
+        <w:tc>
+          <w:tcPr>
+            <w:tcW w:type="dxa" w:w="6560"/>
+            <w:vAlign w:val="center"/>
+          </w:tcPr>
+          <w:p>
+            <w:r>
+              <w:rPr>
+                <w:b w:val="0"/>
+                <w:sz w:val="18"/>
+              </w:rPr>
+              <w:t>Use reminder notifications and dashboard attention items to reduce the risk of late PO processing.</w:t>
+            </w:r>
+          </w:p>
+        </w:tc>
+      </w:tr>
+      <w:tr>
+        <w:tc>
+          <w:tcPr>
+            <w:tcW w:type="dxa" w:w="2800"/>
+            <w:vAlign w:val="center"/>
+          </w:tcPr>
+          <w:p>
+            <w:r>
+              <w:rPr>
+                <w:b w:val="0"/>
+                <w:sz w:val="18"/>
+              </w:rPr>
+              <w:t>Internal pricing exposure</w:t>
+            </w:r>
+          </w:p>
+        </w:tc>
+        <w:tc>
+          <w:tcPr>
+            <w:tcW w:type="dxa" w:w="6560"/>
+            <w:vAlign w:val="center"/>
+          </w:tcPr>
+          <w:p>
+            <w:r>
+              <w:rPr>
+                <w:b w:val="0"/>
+                <w:sz w:val="18"/>
+              </w:rPr>
+              <w:t>Validate printed Invoice and Surat Jalan templates so Markup and Discount remain internal-only fields.</w:t>
+            </w:r>
+          </w:p>
+        </w:tc>
+      </w:tr>
+      <w:tr>
+        <w:tc>
+          <w:tcPr>
+            <w:tcW w:type="dxa" w:w="2800"/>
+            <w:vAlign w:val="center"/>
+          </w:tcPr>
+          <w:p>
+            <w:r>
+              <w:rPr>
+                <w:b w:val="0"/>
+                <w:sz w:val="18"/>
+              </w:rPr>
+              <w:t>Broken sort/filter expectations</w:t>
+            </w:r>
+          </w:p>
+        </w:tc>
+        <w:tc>
+          <w:tcPr>
+            <w:tcW w:type="dxa" w:w="6560"/>
+            <w:vAlign w:val="center"/>
+          </w:tcPr>
+          <w:p>
+            <w:r>
+              <w:rPr>
+                <w:b w:val="0"/>
+                <w:sz w:val="18"/>
+              </w:rPr>
+              <w:t>Test each operational table after UI changes so displayed controls match actual behavior.</w:t>
             </w:r>
           </w:p>
         </w:tc>
@@ -10986,12 +14140,7 @@
         <w:spacing w:before="0" w:after="120" w:line="264" w:lineRule="auto"/>
       </w:pPr>
       <w:r>
-        <w:rPr>
-          <w:rFonts w:ascii="Calibri" w:hAnsi="Calibri"/>
-          <w:color w:val="1F2937"/>
-          <w:sz w:val="22"/>
-        </w:rPr>
-        <w:t>This BRD translates the thesis business context and current local MVP implementation into a structured set of business requirements for the Revenue Cycle Information System for CV Tajuk. The document supports academic review by connecting the stated pain points - scattered records, semi-manual sales-order handling, limited receivable visibility, manual follow-up, and limited dashboard insight - with realistic requirements and scope boundaries.</w:t>
+        <w:t>This BRD translates the thesis business context and current local MVP implementation into a structured set of business requirements for the Revenue Cycle Information System for CV Tajuk, including the updated Product master data and Pre Order/PO transaction scope.</w:t>
       </w:r>
     </w:p>
     <w:p>
@@ -10999,14 +14148,16 @@
         <w:spacing w:before="0" w:after="120" w:line="264" w:lineRule="auto"/>
       </w:pPr>
       <w:r>
-        <w:rPr>
-          <w:rFonts w:ascii="Calibri" w:hAnsi="Calibri"/>
-          <w:color w:val="1F2937"/>
-          <w:sz w:val="22"/>
-        </w:rPr>
-        <w:t>The proposed system should be understood as an academic prototype/MVP that demonstrates how CV Tajuk's revenue-cycle information can be centralized and made more visible. Further production implementation would require additional planning for deployment, security, infrastructure, maintenance, formal SOPs, migration, and integration beyond the current thesis scope.</w:t>
+        <w:t>The proposed system should be understood as an academic prototype/MVP that demonstrates how CV Tajuk's revenue-cycle information can be centralized and made more visible. The updated scope strengthens the prototype by adding Product master data, Pre Order/PO transaction separation, controlled pricing adjustments, PO reminders, and consistent list-table interaction. Further production implementation would still require additional security, deployment, backup, integration, and operational governance work.</w:t>
       </w:r>
     </w:p>
+    <w:p/>
+    <w:p/>
+    <w:p/>
+    <w:p/>
+    <w:p/>
+    <w:p/>
+    <w:p/>
     <w:sectPr>
       <w:footerReference w:type="default" r:id="rId9"/>
       <w:pgSz w:w="12240" w:h="15840"/>

</xml_diff>